<commit_message>
Update documentation to clarify internal project creation and status
Update documentation guides to accurately describe the creation of internal projects by selecting a special "Internal" client, and to include information on the "PAUSE" project status, along with version updates for generated documents.

Replit-Commit-Author: Agent
Replit-Commit-Session-Id: 0226671d-4d7c-40eb-9b18-8775578e8874
Replit-Commit-Checkpoint-Type: full_checkpoint
Replit-Commit-Event-Id: 5795cdd3-b1a8-4e89-bfb3-bfe109fe70d1
Replit-Commit-Screenshot-Url: https://storage.googleapis.com/screenshot-production-us-central1/c82b66a8-f4a7-47f1-bdbd-9ebba5cc2312/0226671d-4d7c-40eb-9b18-8775578e8874/k8sdWMZ
Replit-Helium-Checkpoint-Created: true
</commit_message>
<xml_diff>
--- a/exports/SecureProfitHub-Dashboard-Menu-Guide-EN.docx
+++ b/exports/SecureProfitHub-Dashboard-Menu-Guide-EN.docx
@@ -59,7 +59,7 @@
           <w:sz w:val="22"/>
           <w:szCs w:val="22"/>
         </w:rPr>
-        <w:t xml:space="preserve">Version 1.0</w:t>
+        <w:t xml:space="preserve">Version 1.1</w:t>
       </w:r>
     </w:p>
     <w:p>
@@ -72,7 +72,7 @@
           <w:sz w:val="22"/>
           <w:szCs w:val="22"/>
         </w:rPr>
-        <w:t xml:space="preserve">07 June 2026</w:t>
+        <w:t xml:space="preserve">08 June 2026</w:t>
       </w:r>
     </w:p>
     <w:p>
@@ -5287,6 +5287,372 @@
     </w:p>
     <w:p>
       <w:pPr>
+        <w:pStyle w:val="Heading1"/>
+        <w:spacing w:after="160" w:before="360"/>
+      </w:pPr>
+      <w:r>
+        <w:rPr>
+          <w:rFonts w:ascii="Calibri" w:cs="Calibri" w:eastAsia="Calibri" w:hAnsi="Calibri"/>
+          <w:b/>
+          <w:bCs/>
+          <w:color w:val="0F766E"/>
+          <w:sz w:val="36"/>
+          <w:szCs w:val="36"/>
+        </w:rPr>
+        <w:t xml:space="preserve">4. Notes: Project Kinds &amp; Status</w:t>
+      </w:r>
+    </w:p>
+    <w:p>
+      <w:pPr>
+        <w:spacing w:after="100"/>
+      </w:pPr>
+      <w:r>
+        <w:rPr>
+          <w:rFonts w:ascii="Calibri" w:cs="Calibri" w:eastAsia="Calibri" w:hAnsi="Calibri"/>
+          <w:sz w:val="22"/>
+          <w:szCs w:val="22"/>
+        </w:rPr>
+        <w:t xml:space="preserve">This section supplements the menu guide with two things that affect what you see inside a project's detail page: non-client (internal) project kinds and the PAUSE status.</w:t>
+      </w:r>
+    </w:p>
+    <w:p>
+      <w:pPr>
+        <w:pStyle w:val="Heading2"/>
+        <w:spacing w:after="120" w:before="280"/>
+      </w:pPr>
+      <w:r>
+        <w:rPr>
+          <w:rFonts w:ascii="Calibri" w:cs="Calibri" w:eastAsia="Calibri" w:hAnsi="Calibri"/>
+          <w:b/>
+          <w:bCs/>
+          <w:color w:val="0F766E"/>
+          <w:sz w:val="28"/>
+          <w:szCs w:val="28"/>
+        </w:rPr>
+        <w:t xml:space="preserve">4.1 Non-client (internal) projects</w:t>
+      </w:r>
+    </w:p>
+    <w:p>
+      <w:pPr>
+        <w:spacing w:after="100"/>
+      </w:pPr>
+      <w:r>
+        <w:rPr>
+          <w:rFonts w:ascii="Calibri" w:cs="Calibri" w:eastAsia="Calibri" w:hAnsi="Calibri"/>
+          <w:sz w:val="22"/>
+          <w:szCs w:val="22"/>
+        </w:rPr>
+        <w:t xml:space="preserve">Besides client projects, there are non-commercial project kinds with no client to invoice: INTERNAL, PRESALES, and TRAINING. These still need their effort (mandays) and cost tracked even though they earn no revenue. The status flow is the same (DRAFT → OBSERVATION → ACTIVE → COMPLETE → CLOSED); only the billing and BAST requirements are waived.</w:t>
+      </w:r>
+    </w:p>
+    <w:p>
+      <w:pPr>
+        <w:pStyle w:val="Heading3"/>
+        <w:spacing w:after="80" w:before="200"/>
+      </w:pPr>
+      <w:r>
+        <w:rPr>
+          <w:rFonts w:ascii="Calibri" w:cs="Calibri" w:eastAsia="Calibri" w:hAnsi="Calibri"/>
+          <w:b/>
+          <w:bCs/>
+          <w:sz w:val="24"/>
+          <w:szCs w:val="24"/>
+        </w:rPr>
+        <w:t xml:space="preserve">Non-client project kinds</w:t>
+      </w:r>
+    </w:p>
+    <w:p>
+      <w:pPr>
+        <w:pStyle w:val="ListParagraph"/>
+        <w:numPr>
+          <w:ilvl w:val="0"/>
+          <w:numId w:val="1"/>
+        </w:numPr>
+        <w:spacing w:after="60"/>
+      </w:pPr>
+      <w:r>
+        <w:rPr>
+          <w:rFonts w:ascii="Calibri" w:cs="Calibri" w:eastAsia="Calibri" w:hAnsi="Calibri"/>
+          <w:b/>
+          <w:bCs/>
+          <w:sz w:val="22"/>
+          <w:szCs w:val="22"/>
+        </w:rPr>
+        <w:t xml:space="preserve">INTERNAL — </w:t>
+      </w:r>
+      <w:r>
+        <w:rPr>
+          <w:rFonts w:ascii="Calibri" w:cs="Calibri" w:eastAsia="Calibri" w:hAnsi="Calibri"/>
+          <w:sz w:val="22"/>
+          <w:szCs w:val="22"/>
+        </w:rPr>
+        <w:t xml:space="preserve">internal company work, e.g. building internal tools/products, research, or team operations.</w:t>
+      </w:r>
+    </w:p>
+    <w:p>
+      <w:pPr>
+        <w:pStyle w:val="ListParagraph"/>
+        <w:numPr>
+          <w:ilvl w:val="0"/>
+          <w:numId w:val="1"/>
+        </w:numPr>
+        <w:spacing w:after="60"/>
+      </w:pPr>
+      <w:r>
+        <w:rPr>
+          <w:rFonts w:ascii="Calibri" w:cs="Calibri" w:eastAsia="Calibri" w:hAnsi="Calibri"/>
+          <w:b/>
+          <w:bCs/>
+          <w:sz w:val="22"/>
+          <w:szCs w:val="22"/>
+        </w:rPr>
+        <w:t xml:space="preserve">PRESALES — </w:t>
+      </w:r>
+      <w:r>
+        <w:rPr>
+          <w:rFonts w:ascii="Calibri" w:cs="Calibri" w:eastAsia="Calibri" w:hAnsi="Calibri"/>
+          <w:sz w:val="22"/>
+          <w:szCs w:val="22"/>
+        </w:rPr>
+        <w:t xml:space="preserve">pre-contract activity, e.g. preparing proposals, a Proof of Concept (PoC), or a demo for a prospective client.</w:t>
+      </w:r>
+    </w:p>
+    <w:p>
+      <w:pPr>
+        <w:pStyle w:val="ListParagraph"/>
+        <w:numPr>
+          <w:ilvl w:val="0"/>
+          <w:numId w:val="1"/>
+        </w:numPr>
+        <w:spacing w:after="60"/>
+      </w:pPr>
+      <w:r>
+        <w:rPr>
+          <w:rFonts w:ascii="Calibri" w:cs="Calibri" w:eastAsia="Calibri" w:hAnsi="Calibri"/>
+          <w:b/>
+          <w:bCs/>
+          <w:sz w:val="22"/>
+          <w:szCs w:val="22"/>
+        </w:rPr>
+        <w:t xml:space="preserve">TRAINING — </w:t>
+      </w:r>
+      <w:r>
+        <w:rPr>
+          <w:rFonts w:ascii="Calibri" w:cs="Calibri" w:eastAsia="Calibri" w:hAnsi="Calibri"/>
+          <w:sz w:val="22"/>
+          <w:szCs w:val="22"/>
+        </w:rPr>
+        <w:t xml:space="preserve">internal team training or certification activities.</w:t>
+      </w:r>
+    </w:p>
+    <w:p>
+      <w:pPr>
+        <w:pStyle w:val="Heading3"/>
+        <w:spacing w:after="80" w:before="200"/>
+      </w:pPr>
+      <w:r>
+        <w:rPr>
+          <w:rFonts w:ascii="Calibri" w:cs="Calibri" w:eastAsia="Calibri" w:hAnsi="Calibri"/>
+          <w:b/>
+          <w:bCs/>
+          <w:sz w:val="24"/>
+          <w:szCs w:val="24"/>
+        </w:rPr>
+        <w:t xml:space="preserve">How to create</w:t>
+      </w:r>
+    </w:p>
+    <w:p>
+      <w:pPr>
+        <w:pStyle w:val="ListParagraph"/>
+        <w:numPr>
+          <w:ilvl w:val="0"/>
+          <w:numId w:val="1"/>
+        </w:numPr>
+        <w:spacing w:after="60"/>
+      </w:pPr>
+      <w:r>
+        <w:rPr>
+          <w:rFonts w:ascii="Calibri" w:cs="Calibri" w:eastAsia="Calibri" w:hAnsi="Calibri"/>
+          <w:sz w:val="22"/>
+          <w:szCs w:val="22"/>
+        </w:rPr>
+        <w:t xml:space="preserve">Only Management (or Super Admin) can mark a project as non-client. On Projects &gt; New Project, choose the special client named "Internal" — the project kind automatically becomes Internal and the value field changes to Internal Budget.</w:t>
+      </w:r>
+    </w:p>
+    <w:p>
+      <w:pPr>
+        <w:pStyle w:val="ListParagraph"/>
+        <w:numPr>
+          <w:ilvl w:val="0"/>
+          <w:numId w:val="1"/>
+        </w:numPr>
+        <w:spacing w:after="60"/>
+      </w:pPr>
+      <w:r>
+        <w:rPr>
+          <w:rFonts w:ascii="Calibri" w:cs="Calibri" w:eastAsia="Calibri" w:hAnsi="Calibri"/>
+          <w:sz w:val="22"/>
+          <w:szCs w:val="22"/>
+        </w:rPr>
+        <w:t xml:space="preserve">A client is still selected (the "Internal" client); commercial documents such as the SPK, contract, and VAT are not used. Internal cost is still computed from Estimated Cost plus APPROVED Timesheets and Expenses.</w:t>
+      </w:r>
+    </w:p>
+    <w:p>
+      <w:pPr>
+        <w:pStyle w:val="Heading3"/>
+        <w:spacing w:after="80" w:before="200"/>
+      </w:pPr>
+      <w:r>
+        <w:rPr>
+          <w:rFonts w:ascii="Calibri" w:cs="Calibri" w:eastAsia="Calibri" w:hAnsi="Calibri"/>
+          <w:b/>
+          <w:bCs/>
+          <w:sz w:val="24"/>
+          <w:szCs w:val="24"/>
+        </w:rPr>
+        <w:t xml:space="preserve">What looks different</w:t>
+      </w:r>
+    </w:p>
+    <w:p>
+      <w:pPr>
+        <w:pStyle w:val="ListParagraph"/>
+        <w:numPr>
+          <w:ilvl w:val="0"/>
+          <w:numId w:val="1"/>
+        </w:numPr>
+        <w:spacing w:after="60"/>
+      </w:pPr>
+      <w:r>
+        <w:rPr>
+          <w:rFonts w:ascii="Calibri" w:cs="Calibri" w:eastAsia="Calibri" w:hAnsi="Calibri"/>
+          <w:sz w:val="22"/>
+          <w:szCs w:val="22"/>
+        </w:rPr>
+        <w:t xml:space="preserve">The Billing and Report tabs are hidden for non-client projects because there is no client billing.</w:t>
+      </w:r>
+    </w:p>
+    <w:p>
+      <w:pPr>
+        <w:pStyle w:val="ListParagraph"/>
+        <w:numPr>
+          <w:ilvl w:val="0"/>
+          <w:numId w:val="1"/>
+        </w:numPr>
+        <w:spacing w:after="60"/>
+      </w:pPr>
+      <w:r>
+        <w:rPr>
+          <w:rFonts w:ascii="Calibri" w:cs="Calibri" w:eastAsia="Calibri" w:hAnsi="Calibri"/>
+          <w:sz w:val="22"/>
+          <w:szCs w:val="22"/>
+        </w:rPr>
+        <w:t xml:space="preserve">The Financials tab stays visible but changes into internal cost tracking: Budget (Estimated Cost), Actual Cost, Accrued Cost, Remaining Budget, Burn Rate, and Forecasted Final Cost — with no revenue, profit, or margin figures.</w:t>
+      </w:r>
+    </w:p>
+    <w:p>
+      <w:pPr>
+        <w:pStyle w:val="ListParagraph"/>
+        <w:numPr>
+          <w:ilvl w:val="0"/>
+          <w:numId w:val="1"/>
+        </w:numPr>
+        <w:spacing w:after="60"/>
+      </w:pPr>
+      <w:r>
+        <w:rPr>
+          <w:rFonts w:ascii="Calibri" w:cs="Calibri" w:eastAsia="Calibri" w:hAnsi="Calibri"/>
+          <w:sz w:val="22"/>
+          <w:szCs w:val="22"/>
+        </w:rPr>
+        <w:t xml:space="preserve">At ACTIVE the Contract Value &gt; 0 and 100% Billing Milestone requirements are waived; at COMPLETE there is no need to close PLANNED Billing Milestones and no BAST document is required.</w:t>
+      </w:r>
+    </w:p>
+    <w:p>
+      <w:pPr>
+        <w:pStyle w:val="Heading2"/>
+        <w:spacing w:after="120" w:before="280"/>
+      </w:pPr>
+      <w:r>
+        <w:rPr>
+          <w:rFonts w:ascii="Calibri" w:cs="Calibri" w:eastAsia="Calibri" w:hAnsi="Calibri"/>
+          <w:b/>
+          <w:bCs/>
+          <w:color w:val="0F766E"/>
+          <w:sz w:val="28"/>
+          <w:szCs w:val="28"/>
+        </w:rPr>
+        <w:t xml:space="preserve">4.2 PAUSE status (temporary hold)</w:t>
+      </w:r>
+    </w:p>
+    <w:p>
+      <w:pPr>
+        <w:spacing w:after="100"/>
+      </w:pPr>
+      <w:r>
+        <w:rPr>
+          <w:rFonts w:ascii="Calibri" w:cs="Calibri" w:eastAsia="Calibri" w:hAnsi="Calibri"/>
+          <w:sz w:val="22"/>
+          <w:szCs w:val="22"/>
+        </w:rPr>
+        <w:t xml:space="preserve">PAUSE is used when a project is temporarily halted — for example waiting on client confirmation, documents, or payment — without cancelling it. Once the blocker is resolved, the project resumes to ACTIVE.</w:t>
+      </w:r>
+    </w:p>
+    <w:p>
+      <w:pPr>
+        <w:pStyle w:val="ListParagraph"/>
+        <w:numPr>
+          <w:ilvl w:val="0"/>
+          <w:numId w:val="1"/>
+        </w:numPr>
+        <w:spacing w:after="60"/>
+      </w:pPr>
+      <w:r>
+        <w:rPr>
+          <w:rFonts w:ascii="Calibri" w:cs="Calibri" w:eastAsia="Calibri" w:hAnsi="Calibri"/>
+          <w:sz w:val="22"/>
+          <w:szCs w:val="22"/>
+        </w:rPr>
+        <w:t xml:space="preserve">While PAUSED, ideally no new work hours or costs are logged until the project resumes.</w:t>
+      </w:r>
+    </w:p>
+    <w:p>
+      <w:pPr>
+        <w:pStyle w:val="ListParagraph"/>
+        <w:numPr>
+          <w:ilvl w:val="0"/>
+          <w:numId w:val="1"/>
+        </w:numPr>
+        <w:spacing w:after="60"/>
+      </w:pPr>
+      <w:r>
+        <w:rPr>
+          <w:rFonts w:ascii="Calibri" w:cs="Calibri" w:eastAsia="Calibri" w:hAnsi="Calibri"/>
+          <w:sz w:val="22"/>
+          <w:szCs w:val="22"/>
+        </w:rPr>
+        <w:t xml:space="preserve">PAUSE is temporary and is not the same as COMPLETE or CLOSED; all project data stays intact.</w:t>
+      </w:r>
+    </w:p>
+    <w:p>
+      <w:pPr>
+        <w:pStyle w:val="ListParagraph"/>
+        <w:numPr>
+          <w:ilvl w:val="0"/>
+          <w:numId w:val="1"/>
+        </w:numPr>
+        <w:spacing w:after="60"/>
+      </w:pPr>
+      <w:r>
+        <w:rPr>
+          <w:rFonts w:ascii="Calibri" w:cs="Calibri" w:eastAsia="Calibri" w:hAnsi="Calibri"/>
+          <w:sz w:val="22"/>
+          <w:szCs w:val="22"/>
+        </w:rPr>
+        <w:t xml:space="preserve">The project page shows an explanatory banner while the status is PAUSE so the team understands the situation.</w:t>
+      </w:r>
+    </w:p>
+    <w:p>
+      <w:pPr>
         <w:sectPr>
           <w:pgSz w:w="11906" w:h="16838" w:orient="portrait"/>
           <w:pgMar w:top="1440" w:right="1440" w:bottom="1440" w:left="1440" w:header="708" w:footer="708" w:gutter="0"/>
@@ -5309,7 +5675,7 @@
           <w:sz w:val="36"/>
           <w:szCs w:val="36"/>
         </w:rPr>
-        <w:t xml:space="preserve">4. Matrix: Menu vs Role</w:t>
+        <w:t xml:space="preserve">5. Matrix: Menu vs Role</w:t>
       </w:r>
     </w:p>
     <w:p>

</xml_diff>

<commit_message>
Add task management features for project managers
Enable Project Managers to view, track, and log tasks, and update documentation accordingly.

Replit-Commit-Author: Agent
Replit-Commit-Session-Id: 0226671d-4d7c-40eb-9b18-8775578e8874
Replit-Commit-Checkpoint-Type: full_checkpoint
Replit-Commit-Event-Id: 438a6d32-1f4a-4062-8f83-bb0554835e0f
Replit-Commit-Screenshot-Url: https://storage.googleapis.com/screenshot-production-us-central1/c82b66a8-f4a7-47f1-bdbd-9ebba5cc2312/0226671d-4d7c-40eb-9b18-8775578e8874/k8sdWMZ
Replit-Helium-Checkpoint-Created: true
</commit_message>
<xml_diff>
--- a/exports/SecureProfitHub-Dashboard-Menu-Guide-EN.docx
+++ b/exports/SecureProfitHub-Dashboard-Menu-Guide-EN.docx
@@ -59,7 +59,7 @@
           <w:sz w:val="22"/>
           <w:szCs w:val="22"/>
         </w:rPr>
-        <w:t xml:space="preserve">Version 1.1</w:t>
+        <w:t xml:space="preserve">Version 1.2</w:t>
       </w:r>
     </w:p>
     <w:p>
@@ -2512,7 +2512,7 @@
                 <w:sz w:val="20"/>
                 <w:szCs w:val="20"/>
               </w:rPr>
-              <w:t xml:space="preserve">List of tasks assigned to you and their status.</w:t>
+              <w:t xml:space="preserve">List of tasks assigned to you and their status. PMs who are staffed as a resource and assigned tasks also see this menu.</w:t>
             </w:r>
           </w:p>
         </w:tc>
@@ -2534,7 +2534,7 @@
                 <w:sz w:val="20"/>
                 <w:szCs w:val="20"/>
               </w:rPr>
-              <w:t xml:space="preserve">Sales, Konsultan &amp; Technical Writer, Admin Project, Principal (3 types)</w:t>
+              <w:t xml:space="preserve">Project Manager, Sales, Konsultan &amp; Technical Writer, Admin Project, Principal (3 types)</w:t>
             </w:r>
           </w:p>
         </w:tc>
@@ -2602,7 +2602,7 @@
                 <w:sz w:val="20"/>
                 <w:szCs w:val="20"/>
               </w:rPr>
-              <w:t xml:space="preserve">Konsultan &amp; Technical Writer, Admin Project, Principal (3 types)</w:t>
+              <w:t xml:space="preserve">Project Manager, Konsultan &amp; Technical Writer, Admin Project, Principal (3 types)</w:t>
             </w:r>
           </w:p>
         </w:tc>
@@ -2670,7 +2670,7 @@
                 <w:sz w:val="20"/>
                 <w:szCs w:val="20"/>
               </w:rPr>
-              <w:t xml:space="preserve">Sales, Konsultan &amp; Technical Writer, Admin Project, Principal (3 types)</w:t>
+              <w:t xml:space="preserve">Project Manager, Sales, Konsultan &amp; Technical Writer, Admin Project, Principal (3 types)</w:t>
             </w:r>
           </w:p>
         </w:tc>
@@ -6833,7 +6833,7 @@
                 <w:sz w:val="16"/>
                 <w:szCs w:val="16"/>
               </w:rPr>
-              <w:t xml:space="preserve">–</w:t>
+              <w:t xml:space="preserve">✓</w:t>
             </w:r>
           </w:p>
         </w:tc>
@@ -7085,7 +7085,7 @@
                 <w:sz w:val="16"/>
                 <w:szCs w:val="16"/>
               </w:rPr>
-              <w:t xml:space="preserve">–</w:t>
+              <w:t xml:space="preserve">✓</w:t>
             </w:r>
           </w:p>
         </w:tc>
@@ -7337,7 +7337,7 @@
                 <w:sz w:val="16"/>
                 <w:szCs w:val="16"/>
               </w:rPr>
-              <w:t xml:space="preserve">–</w:t>
+              <w:t xml:space="preserve">✓</w:t>
             </w:r>
           </w:p>
         </w:tc>

</xml_diff>

<commit_message>
Update documentation to include new project manager task tracking
Update dashboard and menu guides to reflect the addition of a "My Tasks" card for project managers, detailing task assignments, status, and time logging functionality.

Replit-Commit-Author: Agent
Replit-Commit-Session-Id: 0226671d-4d7c-40eb-9b18-8775578e8874
Replit-Commit-Checkpoint-Type: full_checkpoint
Replit-Commit-Event-Id: 34ff152c-71c1-45ba-b83e-18fe8c304a71
Replit-Commit-Screenshot-Url: https://storage.googleapis.com/screenshot-production-us-central1/c82b66a8-f4a7-47f1-bdbd-9ebba5cc2312/0226671d-4d7c-40eb-9b18-8775578e8874/k8sdWMZ
Replit-Helium-Checkpoint-Created: true
</commit_message>
<xml_diff>
--- a/exports/SecureProfitHub-Dashboard-Menu-Guide-EN.docx
+++ b/exports/SecureProfitHub-Dashboard-Menu-Guide-EN.docx
@@ -59,7 +59,7 @@
           <w:sz w:val="22"/>
           <w:szCs w:val="22"/>
         </w:rPr>
-        <w:t xml:space="preserve">Version 1.2</w:t>
+        <w:t xml:space="preserve">Version 1.3</w:t>
       </w:r>
     </w:p>
     <w:p>
@@ -311,7 +311,7 @@
           <w:sz w:val="22"/>
           <w:szCs w:val="22"/>
         </w:rPr>
-        <w:t xml:space="preserve">Reports — </w:t>
+        <w:t xml:space="preserve">My Tasks — </w:t>
       </w:r>
       <w:r>
         <w:rPr>
@@ -319,7 +319,7 @@
           <w:sz w:val="22"/>
           <w:szCs w:val="22"/>
         </w:rPr>
-        <w:t xml:space="preserve">Shortcut to the library of export-ready reports.</w:t>
+        <w:t xml:space="preserve">List of tasks assigned to you when the PM is staffed as a project resource, with status and a "Log" button to record hours on the task.</w:t>
       </w:r>
     </w:p>
     <w:p>
@@ -339,7 +339,7 @@
           <w:sz w:val="22"/>
           <w:szCs w:val="22"/>
         </w:rPr>
-        <w:t xml:space="preserve">Expenses Awaiting Approval — </w:t>
+        <w:t xml:space="preserve">Reports — </w:t>
       </w:r>
       <w:r>
         <w:rPr>
@@ -347,7 +347,7 @@
           <w:sz w:val="22"/>
           <w:szCs w:val="22"/>
         </w:rPr>
-        <w:t xml:space="preserve">Count and value of project expenses awaiting your approval.</w:t>
+        <w:t xml:space="preserve">Shortcut to the library of export-ready reports.</w:t>
       </w:r>
     </w:p>
     <w:p>
@@ -367,7 +367,7 @@
           <w:sz w:val="22"/>
           <w:szCs w:val="22"/>
         </w:rPr>
-        <w:t xml:space="preserve">Approval Inbox — </w:t>
+        <w:t xml:space="preserve">Expenses Awaiting Approval — </w:t>
       </w:r>
       <w:r>
         <w:rPr>
@@ -375,7 +375,7 @@
           <w:sz w:val="22"/>
           <w:szCs w:val="22"/>
         </w:rPr>
-        <w:t xml:space="preserve">Summary of timesheets awaiting approval, with an "Approve All" button.</w:t>
+        <w:t xml:space="preserve">Count and value of project expenses awaiting your approval.</w:t>
       </w:r>
     </w:p>
     <w:p>
@@ -395,7 +395,7 @@
           <w:sz w:val="22"/>
           <w:szCs w:val="22"/>
         </w:rPr>
-        <w:t xml:space="preserve">Inbox Detail — </w:t>
+        <w:t xml:space="preserve">Approval Inbox — </w:t>
       </w:r>
       <w:r>
         <w:rPr>
@@ -403,7 +403,7 @@
           <w:sz w:val="22"/>
           <w:szCs w:val="22"/>
         </w:rPr>
-        <w:t xml:space="preserve">Shortcut to open the full approval queue.</w:t>
+        <w:t xml:space="preserve">Summary of timesheets awaiting approval, with an "Approve All" button.</w:t>
       </w:r>
     </w:p>
     <w:p>
@@ -423,7 +423,7 @@
           <w:sz w:val="22"/>
           <w:szCs w:val="22"/>
         </w:rPr>
-        <w:t xml:space="preserve">Personal Time Sheet — </w:t>
+        <w:t xml:space="preserve">Inbox Detail — </w:t>
       </w:r>
       <w:r>
         <w:rPr>
@@ -431,7 +431,7 @@
           <w:sz w:val="22"/>
           <w:szCs w:val="22"/>
         </w:rPr>
-        <w:t xml:space="preserve">Shortcut to log your own working hours.</w:t>
+        <w:t xml:space="preserve">Shortcut to open the full approval queue.</w:t>
       </w:r>
     </w:p>
     <w:p>
@@ -451,7 +451,7 @@
           <w:sz w:val="22"/>
           <w:szCs w:val="22"/>
         </w:rPr>
-        <w:t xml:space="preserve">Timesheet &gt; 48 hours alert — </w:t>
+        <w:t xml:space="preserve">Personal Time Sheet — </w:t>
       </w:r>
       <w:r>
         <w:rPr>
@@ -459,7 +459,7 @@
           <w:sz w:val="22"/>
           <w:szCs w:val="22"/>
         </w:rPr>
-        <w:t xml:space="preserve">A flag when timesheets have waited too long and consultants are blocked — needs prompt action.</w:t>
+        <w:t xml:space="preserve">Shortcut to log your own working hours.</w:t>
       </w:r>
     </w:p>
     <w:p>
@@ -479,7 +479,7 @@
           <w:sz w:val="22"/>
           <w:szCs w:val="22"/>
         </w:rPr>
-        <w:t xml:space="preserve">My Active Projects — </w:t>
+        <w:t xml:space="preserve">Timesheet &gt; 48 hours alert — </w:t>
       </w:r>
       <w:r>
         <w:rPr>
@@ -487,7 +487,7 @@
           <w:sz w:val="22"/>
           <w:szCs w:val="22"/>
         </w:rPr>
-        <w:t xml:space="preserve">Number of projects you manage.</w:t>
+        <w:t xml:space="preserve">A flag when timesheets have waited too long and consultants are blocked — needs prompt action.</w:t>
       </w:r>
     </w:p>
     <w:p>
@@ -507,7 +507,7 @@
           <w:sz w:val="22"/>
           <w:szCs w:val="22"/>
         </w:rPr>
-        <w:t xml:space="preserve">My Team Size — </w:t>
+        <w:t xml:space="preserve">My Active Projects — </w:t>
       </w:r>
       <w:r>
         <w:rPr>
@@ -515,7 +515,7 @@
           <w:sz w:val="22"/>
           <w:szCs w:val="22"/>
         </w:rPr>
-        <w:t xml:space="preserve">Number of team members on your projects and overload status.</w:t>
+        <w:t xml:space="preserve">Number of projects you manage.</w:t>
       </w:r>
     </w:p>
     <w:p>
@@ -535,7 +535,7 @@
           <w:sz w:val="22"/>
           <w:szCs w:val="22"/>
         </w:rPr>
-        <w:t xml:space="preserve">Weighted Margin — </w:t>
+        <w:t xml:space="preserve">My Team Size — </w:t>
       </w:r>
       <w:r>
         <w:rPr>
@@ -543,7 +543,7 @@
           <w:sz w:val="22"/>
           <w:szCs w:val="22"/>
         </w:rPr>
-        <w:t xml:space="preserve">Combined profit margin of your projects.</w:t>
+        <w:t xml:space="preserve">Number of team members on your projects and overload status.</w:t>
       </w:r>
     </w:p>
     <w:p>
@@ -563,7 +563,7 @@
           <w:sz w:val="22"/>
           <w:szCs w:val="22"/>
         </w:rPr>
-        <w:t xml:space="preserve">Total Revenue — </w:t>
+        <w:t xml:space="preserve">Weighted Margin — </w:t>
       </w:r>
       <w:r>
         <w:rPr>
@@ -571,7 +571,7 @@
           <w:sz w:val="22"/>
           <w:szCs w:val="22"/>
         </w:rPr>
-        <w:t xml:space="preserve">Total contract value of the projects you manage.</w:t>
+        <w:t xml:space="preserve">Combined profit margin of your projects.</w:t>
       </w:r>
     </w:p>
     <w:p>
@@ -591,7 +591,7 @@
           <w:sz w:val="22"/>
           <w:szCs w:val="22"/>
         </w:rPr>
-        <w:t xml:space="preserve">Revenue vs Profit (chart) — </w:t>
+        <w:t xml:space="preserve">Total Revenue — </w:t>
       </w:r>
       <w:r>
         <w:rPr>
@@ -599,7 +599,7 @@
           <w:sz w:val="22"/>
           <w:szCs w:val="22"/>
         </w:rPr>
-        <w:t xml:space="preserve">Contract value vs realized profit per project.</w:t>
+        <w:t xml:space="preserve">Total contract value of the projects you manage.</w:t>
       </w:r>
     </w:p>
     <w:p>
@@ -619,7 +619,7 @@
           <w:sz w:val="22"/>
           <w:szCs w:val="22"/>
         </w:rPr>
-        <w:t xml:space="preserve">My Team Utilization — </w:t>
+        <w:t xml:space="preserve">Revenue vs Profit (chart) — </w:t>
       </w:r>
       <w:r>
         <w:rPr>
@@ -627,68 +627,7 @@
           <w:sz w:val="22"/>
           <w:szCs w:val="22"/>
         </w:rPr>
-        <w:t xml:space="preserve">Team-member table: current project, 7-day average hours, and status.</w:t>
-      </w:r>
-    </w:p>
-    <w:p>
-      <w:pPr>
-        <w:pStyle w:val="Heading2"/>
-        <w:spacing w:after="120" w:before="280"/>
-      </w:pPr>
-      <w:r>
-        <w:rPr>
-          <w:rFonts w:ascii="Calibri" w:cs="Calibri" w:eastAsia="Calibri" w:hAnsi="Calibri"/>
-          <w:b/>
-          <w:bCs/>
-          <w:color w:val="0F766E"/>
-          <w:sz w:val="28"/>
-          <w:szCs w:val="28"/>
-        </w:rPr>
-        <w:t xml:space="preserve">2.2 Dashboard for each role</w:t>
-      </w:r>
-    </w:p>
-    <w:p>
-      <w:pPr>
-        <w:spacing w:after="100"/>
-      </w:pPr>
-      <w:r>
-        <w:rPr>
-          <w:rFonts w:ascii="Calibri" w:cs="Calibri" w:eastAsia="Calibri" w:hAnsi="Calibri"/>
-          <w:sz w:val="22"/>
-          <w:szCs w:val="22"/>
-        </w:rPr>
-        <w:t xml:space="preserve">Below is the main content of each role's dashboard. Some financial elements are hidden for roles that may not see margin/cost figures (e.g. Principal, HR).</w:t>
-      </w:r>
-    </w:p>
-    <w:p>
-      <w:pPr>
-        <w:pStyle w:val="Heading3"/>
-        <w:spacing w:after="80" w:before="200"/>
-      </w:pPr>
-      <w:r>
-        <w:rPr>
-          <w:rFonts w:ascii="Calibri" w:cs="Calibri" w:eastAsia="Calibri" w:hAnsi="Calibri"/>
-          <w:b/>
-          <w:bCs/>
-          <w:sz w:val="24"/>
-          <w:szCs w:val="24"/>
-        </w:rPr>
-        <w:t xml:space="preserve">Management (PMO Director)</w:t>
-      </w:r>
-    </w:p>
-    <w:p>
-      <w:pPr>
-        <w:spacing w:after="100"/>
-      </w:pPr>
-      <w:r>
-        <w:rPr>
-          <w:rFonts w:ascii="Calibri" w:cs="Calibri" w:eastAsia="Calibri" w:hAnsi="Calibri"/>
-          <w:i/>
-          <w:iCs/>
-          <w:sz w:val="22"/>
-          <w:szCs w:val="22"/>
-        </w:rPr>
-        <w:t xml:space="preserve">Executive view across the whole portfolio.</w:t>
+        <w:t xml:space="preserve">Contract value vs realized profit per project.</w:t>
       </w:r>
     </w:p>
     <w:p>
@@ -708,7 +647,7 @@
           <w:sz w:val="22"/>
           <w:szCs w:val="22"/>
         </w:rPr>
-        <w:t xml:space="preserve">Active Projects / Total Revenue / Weighted Margin — </w:t>
+        <w:t xml:space="preserve">My Team Utilization — </w:t>
       </w:r>
       <w:r>
         <w:rPr>
@@ -716,7 +655,68 @@
           <w:sz w:val="22"/>
           <w:szCs w:val="22"/>
         </w:rPr>
-        <w:t xml:space="preserve">Portfolio KPIs: active-project count, total contract value, and weighted margin.</w:t>
+        <w:t xml:space="preserve">Team-member table: current project, 7-day average hours, and status.</w:t>
+      </w:r>
+    </w:p>
+    <w:p>
+      <w:pPr>
+        <w:pStyle w:val="Heading2"/>
+        <w:spacing w:after="120" w:before="280"/>
+      </w:pPr>
+      <w:r>
+        <w:rPr>
+          <w:rFonts w:ascii="Calibri" w:cs="Calibri" w:eastAsia="Calibri" w:hAnsi="Calibri"/>
+          <w:b/>
+          <w:bCs/>
+          <w:color w:val="0F766E"/>
+          <w:sz w:val="28"/>
+          <w:szCs w:val="28"/>
+        </w:rPr>
+        <w:t xml:space="preserve">2.2 Dashboard for each role</w:t>
+      </w:r>
+    </w:p>
+    <w:p>
+      <w:pPr>
+        <w:spacing w:after="100"/>
+      </w:pPr>
+      <w:r>
+        <w:rPr>
+          <w:rFonts w:ascii="Calibri" w:cs="Calibri" w:eastAsia="Calibri" w:hAnsi="Calibri"/>
+          <w:sz w:val="22"/>
+          <w:szCs w:val="22"/>
+        </w:rPr>
+        <w:t xml:space="preserve">Below is the main content of each role's dashboard. Some financial elements are hidden for roles that may not see margin/cost figures (e.g. Principal, HR).</w:t>
+      </w:r>
+    </w:p>
+    <w:p>
+      <w:pPr>
+        <w:pStyle w:val="Heading3"/>
+        <w:spacing w:after="80" w:before="200"/>
+      </w:pPr>
+      <w:r>
+        <w:rPr>
+          <w:rFonts w:ascii="Calibri" w:cs="Calibri" w:eastAsia="Calibri" w:hAnsi="Calibri"/>
+          <w:b/>
+          <w:bCs/>
+          <w:sz w:val="24"/>
+          <w:szCs w:val="24"/>
+        </w:rPr>
+        <w:t xml:space="preserve">Management (PMO Director)</w:t>
+      </w:r>
+    </w:p>
+    <w:p>
+      <w:pPr>
+        <w:spacing w:after="100"/>
+      </w:pPr>
+      <w:r>
+        <w:rPr>
+          <w:rFonts w:ascii="Calibri" w:cs="Calibri" w:eastAsia="Calibri" w:hAnsi="Calibri"/>
+          <w:i/>
+          <w:iCs/>
+          <w:sz w:val="22"/>
+          <w:szCs w:val="22"/>
+        </w:rPr>
+        <w:t xml:space="preserve">Executive view across the whole portfolio.</w:t>
       </w:r>
     </w:p>
     <w:p>
@@ -736,7 +736,7 @@
           <w:sz w:val="22"/>
           <w:szCs w:val="22"/>
         </w:rPr>
-        <w:t xml:space="preserve">Projects at risk (margin &lt; 10%) — </w:t>
+        <w:t xml:space="preserve">Active Projects / Total Revenue / Weighted Margin — </w:t>
       </w:r>
       <w:r>
         <w:rPr>
@@ -744,7 +744,7 @@
           <w:sz w:val="22"/>
           <w:szCs w:val="22"/>
         </w:rPr>
-        <w:t xml:space="preserve">List of active projects with thin margins.</w:t>
+        <w:t xml:space="preserve">Portfolio KPIs: active-project count, total contract value, and weighted margin.</w:t>
       </w:r>
     </w:p>
     <w:p>
@@ -764,7 +764,7 @@
           <w:sz w:val="22"/>
           <w:szCs w:val="22"/>
         </w:rPr>
-        <w:t xml:space="preserve">Pending Approvals — </w:t>
+        <w:t xml:space="preserve">Projects at risk (margin &lt; 10%) — </w:t>
       </w:r>
       <w:r>
         <w:rPr>
@@ -772,7 +772,7 @@
           <w:sz w:val="22"/>
           <w:szCs w:val="22"/>
         </w:rPr>
-        <w:t xml:space="preserve">Count of timesheets awaiting approval.</w:t>
+        <w:t xml:space="preserve">List of active projects with thin margins.</w:t>
       </w:r>
     </w:p>
     <w:p>
@@ -792,7 +792,7 @@
           <w:sz w:val="22"/>
           <w:szCs w:val="22"/>
         </w:rPr>
-        <w:t xml:space="preserve">Cash Flow Forecast — </w:t>
+        <w:t xml:space="preserve">Pending Approvals — </w:t>
       </w:r>
       <w:r>
         <w:rPr>
@@ -800,7 +800,7 @@
           <w:sz w:val="22"/>
           <w:szCs w:val="22"/>
         </w:rPr>
-        <w:t xml:space="preserve">6-month projected billing inflow.</w:t>
+        <w:t xml:space="preserve">Count of timesheets awaiting approval.</w:t>
       </w:r>
     </w:p>
     <w:p>
@@ -820,7 +820,7 @@
           <w:sz w:val="22"/>
           <w:szCs w:val="22"/>
         </w:rPr>
-        <w:t xml:space="preserve">Profit Margin Trend — </w:t>
+        <w:t xml:space="preserve">Cash Flow Forecast — </w:t>
       </w:r>
       <w:r>
         <w:rPr>
@@ -828,7 +828,7 @@
           <w:sz w:val="22"/>
           <w:szCs w:val="22"/>
         </w:rPr>
-        <w:t xml:space="preserve">Monthly cost vs revenue trend.</w:t>
+        <w:t xml:space="preserve">6-month projected billing inflow.</w:t>
       </w:r>
     </w:p>
     <w:p>
@@ -848,7 +848,7 @@
           <w:sz w:val="22"/>
           <w:szCs w:val="22"/>
         </w:rPr>
-        <w:t xml:space="preserve">Project Status / Profitability by Project Type — </w:t>
+        <w:t xml:space="preserve">Profit Margin Trend — </w:t>
       </w:r>
       <w:r>
         <w:rPr>
@@ -856,7 +856,7 @@
           <w:sz w:val="22"/>
           <w:szCs w:val="22"/>
         </w:rPr>
-        <w:t xml:space="preserve">Project-status distribution and profit by service line.</w:t>
+        <w:t xml:space="preserve">Monthly cost vs revenue trend.</w:t>
       </w:r>
     </w:p>
     <w:p>
@@ -876,7 +876,7 @@
           <w:sz w:val="22"/>
           <w:szCs w:val="22"/>
         </w:rPr>
-        <w:t xml:space="preserve">Top Projects by Margin / Recent Activity — </w:t>
+        <w:t xml:space="preserve">Project Status / Profitability by Project Type — </w:t>
       </w:r>
       <w:r>
         <w:rPr>
@@ -884,38 +884,7 @@
           <w:sz w:val="22"/>
           <w:szCs w:val="22"/>
         </w:rPr>
-        <w:t xml:space="preserve">Best-performing projects and the latest activity log.</w:t>
-      </w:r>
-    </w:p>
-    <w:p>
-      <w:pPr>
-        <w:pStyle w:val="Heading3"/>
-        <w:spacing w:after="80" w:before="200"/>
-      </w:pPr>
-      <w:r>
-        <w:rPr>
-          <w:rFonts w:ascii="Calibri" w:cs="Calibri" w:eastAsia="Calibri" w:hAnsi="Calibri"/>
-          <w:b/>
-          <w:bCs/>
-          <w:sz w:val="24"/>
-          <w:szCs w:val="24"/>
-        </w:rPr>
-        <w:t xml:space="preserve">Project Manager</w:t>
-      </w:r>
-    </w:p>
-    <w:p>
-      <w:pPr>
-        <w:spacing w:after="100"/>
-      </w:pPr>
-      <w:r>
-        <w:rPr>
-          <w:rFonts w:ascii="Calibri" w:cs="Calibri" w:eastAsia="Calibri" w:hAnsi="Calibri"/>
-          <w:i/>
-          <w:iCs/>
-          <w:sz w:val="22"/>
-          <w:szCs w:val="22"/>
-        </w:rPr>
-        <w:t xml:space="preserve">Focused on managed projects and the approval queue (see Section 2.1 for details).</w:t>
+        <w:t xml:space="preserve">Project-status distribution and profit by service line.</w:t>
       </w:r>
     </w:p>
     <w:p>
@@ -935,7 +904,7 @@
           <w:sz w:val="22"/>
           <w:szCs w:val="22"/>
         </w:rPr>
-        <w:t xml:space="preserve">My Active Projects / My Team Size / Weighted Margin / Total Revenue — </w:t>
+        <w:t xml:space="preserve">Top Projects by Margin / Recent Activity — </w:t>
       </w:r>
       <w:r>
         <w:rPr>
@@ -943,7 +912,94 @@
           <w:sz w:val="22"/>
           <w:szCs w:val="22"/>
         </w:rPr>
+        <w:t xml:space="preserve">Best-performing projects and the latest activity log.</w:t>
+      </w:r>
+    </w:p>
+    <w:p>
+      <w:pPr>
+        <w:pStyle w:val="Heading3"/>
+        <w:spacing w:after="80" w:before="200"/>
+      </w:pPr>
+      <w:r>
+        <w:rPr>
+          <w:rFonts w:ascii="Calibri" w:cs="Calibri" w:eastAsia="Calibri" w:hAnsi="Calibri"/>
+          <w:b/>
+          <w:bCs/>
+          <w:sz w:val="24"/>
+          <w:szCs w:val="24"/>
+        </w:rPr>
+        <w:t xml:space="preserve">Project Manager</w:t>
+      </w:r>
+    </w:p>
+    <w:p>
+      <w:pPr>
+        <w:spacing w:after="100"/>
+      </w:pPr>
+      <w:r>
+        <w:rPr>
+          <w:rFonts w:ascii="Calibri" w:cs="Calibri" w:eastAsia="Calibri" w:hAnsi="Calibri"/>
+          <w:i/>
+          <w:iCs/>
+          <w:sz w:val="22"/>
+          <w:szCs w:val="22"/>
+        </w:rPr>
+        <w:t xml:space="preserve">Focused on managed projects and the approval queue (see Section 2.1 for details).</w:t>
+      </w:r>
+    </w:p>
+    <w:p>
+      <w:pPr>
+        <w:pStyle w:val="ListParagraph"/>
+        <w:numPr>
+          <w:ilvl w:val="0"/>
+          <w:numId w:val="1"/>
+        </w:numPr>
+        <w:spacing w:after="60"/>
+      </w:pPr>
+      <w:r>
+        <w:rPr>
+          <w:rFonts w:ascii="Calibri" w:cs="Calibri" w:eastAsia="Calibri" w:hAnsi="Calibri"/>
+          <w:b/>
+          <w:bCs/>
+          <w:sz w:val="22"/>
+          <w:szCs w:val="22"/>
+        </w:rPr>
+        <w:t xml:space="preserve">My Active Projects / My Team Size / Weighted Margin / Total Revenue — </w:t>
+      </w:r>
+      <w:r>
+        <w:rPr>
+          <w:rFonts w:ascii="Calibri" w:cs="Calibri" w:eastAsia="Calibri" w:hAnsi="Calibri"/>
+          <w:sz w:val="22"/>
+          <w:szCs w:val="22"/>
+        </w:rPr>
         <w:t xml:space="preserve">The PM's personal portfolio KPIs.</w:t>
+      </w:r>
+    </w:p>
+    <w:p>
+      <w:pPr>
+        <w:pStyle w:val="ListParagraph"/>
+        <w:numPr>
+          <w:ilvl w:val="0"/>
+          <w:numId w:val="1"/>
+        </w:numPr>
+        <w:spacing w:after="60"/>
+      </w:pPr>
+      <w:r>
+        <w:rPr>
+          <w:rFonts w:ascii="Calibri" w:cs="Calibri" w:eastAsia="Calibri" w:hAnsi="Calibri"/>
+          <w:b/>
+          <w:bCs/>
+          <w:sz w:val="22"/>
+          <w:szCs w:val="22"/>
+        </w:rPr>
+        <w:t xml:space="preserve">My Tasks — </w:t>
+      </w:r>
+      <w:r>
+        <w:rPr>
+          <w:rFonts w:ascii="Calibri" w:cs="Calibri" w:eastAsia="Calibri" w:hAnsi="Calibri"/>
+          <w:sz w:val="22"/>
+          <w:szCs w:val="22"/>
+        </w:rPr>
+        <w:t xml:space="preserve">Tasks assigned to you when staffed as a project resource, with a "Log" button to record hours.</w:t>
       </w:r>
     </w:p>
     <w:p>

</xml_diff>

<commit_message>
Update documentation to reflect new features and improved system operations
Update feature and dashboard documentation, including new AI Copilot, CRM import, and mobile app features. Refine readiness gates and add details on billable task exclusions and version updates.

Replit-Commit-Author: Agent
Replit-Commit-Session-Id: 0226671d-4d7c-40eb-9b18-8775578e8874
Replit-Commit-Checkpoint-Type: full_checkpoint
Replit-Commit-Event-Id: 3091c40a-a4c7-4a3c-b67e-0a961541ae45
Replit-Commit-Screenshot-Url: https://storage.googleapis.com/screenshot-production-us-central1/c82b66a8-f4a7-47f1-bdbd-9ebba5cc2312/0226671d-4d7c-40eb-9b18-8775578e8874/aNZRSHa
Replit-Helium-Checkpoint-Created: true
</commit_message>
<xml_diff>
--- a/exports/SecureProfitHub-Dashboard-Menu-Guide-EN.docx
+++ b/exports/SecureProfitHub-Dashboard-Menu-Guide-EN.docx
@@ -59,7 +59,7 @@
           <w:sz w:val="22"/>
           <w:szCs w:val="22"/>
         </w:rPr>
-        <w:t xml:space="preserve">Version 1.3</w:t>
+        <w:t xml:space="preserve">Version 1.4</w:t>
       </w:r>
     </w:p>
     <w:p>
@@ -72,7 +72,7 @@
           <w:sz w:val="22"/>
           <w:szCs w:val="22"/>
         </w:rPr>
-        <w:t xml:space="preserve">08 June 2026</w:t>
+        <w:t xml:space="preserve">23 July 2026</w:t>
       </w:r>
     </w:p>
     <w:p>
@@ -163,6 +163,24 @@
           <w:szCs w:val="22"/>
         </w:rPr>
         <w:t xml:space="preserve">Menu names inside the app are in English, so menu names are kept verbatim in this document.</w:t>
+      </w:r>
+    </w:p>
+    <w:p>
+      <w:pPr>
+        <w:pStyle w:val="ListParagraph"/>
+        <w:numPr>
+          <w:ilvl w:val="0"/>
+          <w:numId w:val="1"/>
+        </w:numPr>
+        <w:spacing w:after="60"/>
+      </w:pPr>
+      <w:r>
+        <w:rPr>
+          <w:rFonts w:ascii="Calibri" w:cs="Calibri" w:eastAsia="Calibri" w:hAnsi="Calibri"/>
+          <w:sz w:val="22"/>
+          <w:szCs w:val="22"/>
+        </w:rPr>
+        <w:t xml:space="preserve">The header (top right) has a Notifications bell for all roles: it holds in-app notices (e.g. timesheet approved/rejected, approval reminders). For important events the system can also send an email when Management has enabled the email feature.</w:t>
       </w:r>
     </w:p>
     <w:p>
@@ -4690,7 +4708,7 @@
                 <w:sz w:val="20"/>
                 <w:szCs w:val="20"/>
               </w:rPr>
-              <w:t xml:space="preserve">Top Performers</w:t>
+              <w:t xml:space="preserve">PM Dashboards</w:t>
             </w:r>
           </w:p>
         </w:tc>
@@ -4712,7 +4730,7 @@
                 <w:sz w:val="20"/>
                 <w:szCs w:val="20"/>
               </w:rPr>
-              <w:t xml:space="preserve">List of top-performing team members.</w:t>
+              <w:t xml:space="preserve">Monitor each Project Manager's portfolio at a glance — projects, health, margin, and approval queue (read-only).</w:t>
             </w:r>
           </w:p>
         </w:tc>
@@ -4734,7 +4752,7 @@
                 <w:sz w:val="20"/>
                 <w:szCs w:val="20"/>
               </w:rPr>
-              <w:t xml:space="preserve">Management, Principal (3 types)</w:t>
+              <w:t xml:space="preserve">Management</w:t>
             </w:r>
           </w:p>
         </w:tc>
@@ -4758,7 +4776,7 @@
                 <w:sz w:val="20"/>
                 <w:szCs w:val="20"/>
               </w:rPr>
-              <w:t xml:space="preserve">VAT Recap</w:t>
+              <w:t xml:space="preserve">Portfolio Monitor</w:t>
             </w:r>
           </w:p>
         </w:tc>
@@ -4780,7 +4798,7 @@
                 <w:sz w:val="20"/>
                 <w:szCs w:val="20"/>
               </w:rPr>
-              <w:t xml:space="preserve">VAT recap from INVOICED/PAID milestones per year.</w:t>
+              <w:t xml:space="preserve">PMO-wide view of every commercial project — billing, hours vs budget, estimated vs actual margin, anomaly flags, and a weekly invoice forecast (read-only).</w:t>
             </w:r>
           </w:p>
         </w:tc>
@@ -4802,7 +4820,7 @@
                 <w:sz w:val="20"/>
                 <w:szCs w:val="20"/>
               </w:rPr>
-              <w:t xml:space="preserve">Management, Finance</w:t>
+              <w:t xml:space="preserve">Management</w:t>
             </w:r>
           </w:p>
         </w:tc>
@@ -4826,7 +4844,7 @@
                 <w:sz w:val="20"/>
                 <w:szCs w:val="20"/>
               </w:rPr>
-              <w:t xml:space="preserve">Invoice Settings</w:t>
+              <w:t xml:space="preserve">AI Executive Copilot</w:t>
             </w:r>
           </w:p>
         </w:tc>
@@ -4848,7 +4866,7 @@
                 <w:sz w:val="20"/>
                 <w:szCs w:val="20"/>
               </w:rPr>
-              <w:t xml:space="preserve">Company &amp; bank details that appear on invoices.</w:t>
+              <w:t xml:space="preserve">AI-narrated executive briefing: portfolio health score, risk highlights, and Top 5 actions. All numbers are computed by the system (deterministic); the AI only writes the narrative. Generated on demand via a Generate button.</w:t>
             </w:r>
           </w:p>
         </w:tc>
@@ -4870,7 +4888,7 @@
                 <w:sz w:val="20"/>
                 <w:szCs w:val="20"/>
               </w:rPr>
-              <w:t xml:space="preserve">Management, Finance</w:t>
+              <w:t xml:space="preserve">Management</w:t>
             </w:r>
           </w:p>
         </w:tc>
@@ -4894,7 +4912,7 @@
                 <w:sz w:val="20"/>
                 <w:szCs w:val="20"/>
               </w:rPr>
-              <w:t xml:space="preserve">Survey Results</w:t>
+              <w:t xml:space="preserve">Top Performers</w:t>
             </w:r>
           </w:p>
         </w:tc>
@@ -4916,7 +4934,7 @@
                 <w:sz w:val="20"/>
                 <w:szCs w:val="20"/>
               </w:rPr>
-              <w:t xml:space="preserve">Client satisfaction (CSAT) survey results.</w:t>
+              <w:t xml:space="preserve">List of top-performing team members.</w:t>
             </w:r>
           </w:p>
         </w:tc>
@@ -4938,7 +4956,7 @@
                 <w:sz w:val="20"/>
                 <w:szCs w:val="20"/>
               </w:rPr>
-              <w:t xml:space="preserve">Management, Sales</w:t>
+              <w:t xml:space="preserve">Management, Principal (3 types)</w:t>
             </w:r>
           </w:p>
         </w:tc>
@@ -4962,7 +4980,7 @@
                 <w:sz w:val="20"/>
                 <w:szCs w:val="20"/>
               </w:rPr>
-              <w:t xml:space="preserve">Survey Template</w:t>
+              <w:t xml:space="preserve">VAT Recap</w:t>
             </w:r>
           </w:p>
         </w:tc>
@@ -4984,7 +5002,7 @@
                 <w:sz w:val="20"/>
                 <w:szCs w:val="20"/>
               </w:rPr>
-              <w:t xml:space="preserve">Client satisfaction survey question template.</w:t>
+              <w:t xml:space="preserve">VAT recap from INVOICED/PAID milestones per year.</w:t>
             </w:r>
           </w:p>
         </w:tc>
@@ -5006,7 +5024,7 @@
                 <w:sz w:val="20"/>
                 <w:szCs w:val="20"/>
               </w:rPr>
-              <w:t xml:space="preserve">Management</w:t>
+              <w:t xml:space="preserve">Management, Finance</w:t>
             </w:r>
           </w:p>
         </w:tc>
@@ -5030,7 +5048,7 @@
                 <w:sz w:val="20"/>
                 <w:szCs w:val="20"/>
               </w:rPr>
-              <w:t xml:space="preserve">Audit Log</w:t>
+              <w:t xml:space="preserve">Invoice Settings</w:t>
             </w:r>
           </w:p>
         </w:tc>
@@ -5052,6 +5070,210 @@
                 <w:sz w:val="20"/>
                 <w:szCs w:val="20"/>
               </w:rPr>
+              <w:t xml:space="preserve">Company &amp; bank details that appear on invoices.</w:t>
+            </w:r>
+          </w:p>
+        </w:tc>
+        <w:tc>
+          <w:tcPr>
+            <w:tcW w:type="pct" w:w="30%"/>
+            <w:shd w:fill="FFFFFF" w:color="auto" w:val="clear"/>
+            <w:tcMar>
+              <w:top w:type="dxa" w:w="60"/>
+              <w:left w:type="dxa" w:w="80"/>
+              <w:bottom w:type="dxa" w:w="60"/>
+              <w:right w:type="dxa" w:w="80"/>
+            </w:tcMar>
+          </w:tcPr>
+          <w:p>
+            <w:r>
+              <w:rPr>
+                <w:rFonts w:ascii="Calibri" w:cs="Calibri" w:eastAsia="Calibri" w:hAnsi="Calibri"/>
+                <w:sz w:val="20"/>
+                <w:szCs w:val="20"/>
+              </w:rPr>
+              <w:t xml:space="preserve">Management, Finance</w:t>
+            </w:r>
+          </w:p>
+        </w:tc>
+      </w:tr>
+      <w:tr>
+        <w:tc>
+          <w:tcPr>
+            <w:tcW w:type="pct" w:w="20%"/>
+            <w:shd w:fill="F1F5F9" w:color="auto" w:val="clear"/>
+            <w:tcMar>
+              <w:top w:type="dxa" w:w="60"/>
+              <w:left w:type="dxa" w:w="80"/>
+              <w:bottom w:type="dxa" w:w="60"/>
+              <w:right w:type="dxa" w:w="80"/>
+            </w:tcMar>
+          </w:tcPr>
+          <w:p>
+            <w:r>
+              <w:rPr>
+                <w:rFonts w:ascii="Calibri" w:cs="Calibri" w:eastAsia="Calibri" w:hAnsi="Calibri"/>
+                <w:sz w:val="20"/>
+                <w:szCs w:val="20"/>
+              </w:rPr>
+              <w:t xml:space="preserve">Survey Results</w:t>
+            </w:r>
+          </w:p>
+        </w:tc>
+        <w:tc>
+          <w:tcPr>
+            <w:tcW w:type="pct" w:w="50%"/>
+            <w:shd w:fill="F1F5F9" w:color="auto" w:val="clear"/>
+            <w:tcMar>
+              <w:top w:type="dxa" w:w="60"/>
+              <w:left w:type="dxa" w:w="80"/>
+              <w:bottom w:type="dxa" w:w="60"/>
+              <w:right w:type="dxa" w:w="80"/>
+            </w:tcMar>
+          </w:tcPr>
+          <w:p>
+            <w:r>
+              <w:rPr>
+                <w:rFonts w:ascii="Calibri" w:cs="Calibri" w:eastAsia="Calibri" w:hAnsi="Calibri"/>
+                <w:sz w:val="20"/>
+                <w:szCs w:val="20"/>
+              </w:rPr>
+              <w:t xml:space="preserve">Client satisfaction (CSAT) survey results.</w:t>
+            </w:r>
+          </w:p>
+        </w:tc>
+        <w:tc>
+          <w:tcPr>
+            <w:tcW w:type="pct" w:w="30%"/>
+            <w:shd w:fill="F1F5F9" w:color="auto" w:val="clear"/>
+            <w:tcMar>
+              <w:top w:type="dxa" w:w="60"/>
+              <w:left w:type="dxa" w:w="80"/>
+              <w:bottom w:type="dxa" w:w="60"/>
+              <w:right w:type="dxa" w:w="80"/>
+            </w:tcMar>
+          </w:tcPr>
+          <w:p>
+            <w:r>
+              <w:rPr>
+                <w:rFonts w:ascii="Calibri" w:cs="Calibri" w:eastAsia="Calibri" w:hAnsi="Calibri"/>
+                <w:sz w:val="20"/>
+                <w:szCs w:val="20"/>
+              </w:rPr>
+              <w:t xml:space="preserve">Management, Sales</w:t>
+            </w:r>
+          </w:p>
+        </w:tc>
+      </w:tr>
+      <w:tr>
+        <w:tc>
+          <w:tcPr>
+            <w:tcW w:type="pct" w:w="20%"/>
+            <w:shd w:fill="FFFFFF" w:color="auto" w:val="clear"/>
+            <w:tcMar>
+              <w:top w:type="dxa" w:w="60"/>
+              <w:left w:type="dxa" w:w="80"/>
+              <w:bottom w:type="dxa" w:w="60"/>
+              <w:right w:type="dxa" w:w="80"/>
+            </w:tcMar>
+          </w:tcPr>
+          <w:p>
+            <w:r>
+              <w:rPr>
+                <w:rFonts w:ascii="Calibri" w:cs="Calibri" w:eastAsia="Calibri" w:hAnsi="Calibri"/>
+                <w:sz w:val="20"/>
+                <w:szCs w:val="20"/>
+              </w:rPr>
+              <w:t xml:space="preserve">Survey Template</w:t>
+            </w:r>
+          </w:p>
+        </w:tc>
+        <w:tc>
+          <w:tcPr>
+            <w:tcW w:type="pct" w:w="50%"/>
+            <w:shd w:fill="FFFFFF" w:color="auto" w:val="clear"/>
+            <w:tcMar>
+              <w:top w:type="dxa" w:w="60"/>
+              <w:left w:type="dxa" w:w="80"/>
+              <w:bottom w:type="dxa" w:w="60"/>
+              <w:right w:type="dxa" w:w="80"/>
+            </w:tcMar>
+          </w:tcPr>
+          <w:p>
+            <w:r>
+              <w:rPr>
+                <w:rFonts w:ascii="Calibri" w:cs="Calibri" w:eastAsia="Calibri" w:hAnsi="Calibri"/>
+                <w:sz w:val="20"/>
+                <w:szCs w:val="20"/>
+              </w:rPr>
+              <w:t xml:space="preserve">Client satisfaction survey question template.</w:t>
+            </w:r>
+          </w:p>
+        </w:tc>
+        <w:tc>
+          <w:tcPr>
+            <w:tcW w:type="pct" w:w="30%"/>
+            <w:shd w:fill="FFFFFF" w:color="auto" w:val="clear"/>
+            <w:tcMar>
+              <w:top w:type="dxa" w:w="60"/>
+              <w:left w:type="dxa" w:w="80"/>
+              <w:bottom w:type="dxa" w:w="60"/>
+              <w:right w:type="dxa" w:w="80"/>
+            </w:tcMar>
+          </w:tcPr>
+          <w:p>
+            <w:r>
+              <w:rPr>
+                <w:rFonts w:ascii="Calibri" w:cs="Calibri" w:eastAsia="Calibri" w:hAnsi="Calibri"/>
+                <w:sz w:val="20"/>
+                <w:szCs w:val="20"/>
+              </w:rPr>
+              <w:t xml:space="preserve">Management</w:t>
+            </w:r>
+          </w:p>
+        </w:tc>
+      </w:tr>
+      <w:tr>
+        <w:tc>
+          <w:tcPr>
+            <w:tcW w:type="pct" w:w="20%"/>
+            <w:shd w:fill="F1F5F9" w:color="auto" w:val="clear"/>
+            <w:tcMar>
+              <w:top w:type="dxa" w:w="60"/>
+              <w:left w:type="dxa" w:w="80"/>
+              <w:bottom w:type="dxa" w:w="60"/>
+              <w:right w:type="dxa" w:w="80"/>
+            </w:tcMar>
+          </w:tcPr>
+          <w:p>
+            <w:r>
+              <w:rPr>
+                <w:rFonts w:ascii="Calibri" w:cs="Calibri" w:eastAsia="Calibri" w:hAnsi="Calibri"/>
+                <w:sz w:val="20"/>
+                <w:szCs w:val="20"/>
+              </w:rPr>
+              <w:t xml:space="preserve">Audit Log</w:t>
+            </w:r>
+          </w:p>
+        </w:tc>
+        <w:tc>
+          <w:tcPr>
+            <w:tcW w:type="pct" w:w="50%"/>
+            <w:shd w:fill="F1F5F9" w:color="auto" w:val="clear"/>
+            <w:tcMar>
+              <w:top w:type="dxa" w:w="60"/>
+              <w:left w:type="dxa" w:w="80"/>
+              <w:bottom w:type="dxa" w:w="60"/>
+              <w:right w:type="dxa" w:w="80"/>
+            </w:tcMar>
+          </w:tcPr>
+          <w:p>
+            <w:r>
+              <w:rPr>
+                <w:rFonts w:ascii="Calibri" w:cs="Calibri" w:eastAsia="Calibri" w:hAnsi="Calibri"/>
+                <w:sz w:val="20"/>
+                <w:szCs w:val="20"/>
+              </w:rPr>
               <w:t xml:space="preserve">System-wide activity/audit log.</w:t>
             </w:r>
           </w:p>
@@ -5059,7 +5281,7 @@
         <w:tc>
           <w:tcPr>
             <w:tcW w:type="pct" w:w="30%"/>
-            <w:shd w:fill="FFFFFF" w:color="auto" w:val="clear"/>
+            <w:shd w:fill="F1F5F9" w:color="auto" w:val="clear"/>
             <w:tcMar>
               <w:top w:type="dxa" w:w="60"/>
               <w:left w:type="dxa" w:w="80"/>
@@ -5240,7 +5462,7 @@
                 <w:sz w:val="20"/>
                 <w:szCs w:val="20"/>
               </w:rPr>
-              <w:t xml:space="preserve">Personal account &amp; preferences settings.</w:t>
+              <w:t xml:space="preserve">Personal account &amp; preferences settings. Management additionally sees an Email Notifications switch that turns system-wide email notifications on/off.</w:t>
             </w:r>
           </w:p>
         </w:tc>
@@ -13139,7 +13361,7 @@
                 <w:sz w:val="16"/>
                 <w:szCs w:val="16"/>
               </w:rPr>
-              <w:t xml:space="preserve">Top Performers</w:t>
+              <w:t xml:space="preserve">PM Dashboards</w:t>
             </w:r>
           </w:p>
         </w:tc>
@@ -13339,7 +13561,7 @@
                 <w:sz w:val="16"/>
                 <w:szCs w:val="16"/>
               </w:rPr>
-              <w:t xml:space="preserve">✓</w:t>
+              <w:t xml:space="preserve">–</w:t>
             </w:r>
           </w:p>
         </w:tc>
@@ -13391,7 +13613,7 @@
                 <w:sz w:val="16"/>
                 <w:szCs w:val="16"/>
               </w:rPr>
-              <w:t xml:space="preserve">VAT Recap</w:t>
+              <w:t xml:space="preserve">Portfolio Monitor</w:t>
             </w:r>
           </w:p>
         </w:tc>
@@ -13541,7 +13763,7 @@
                 <w:sz w:val="16"/>
                 <w:szCs w:val="16"/>
               </w:rPr>
-              <w:t xml:space="preserve">✓</w:t>
+              <w:t xml:space="preserve">–</w:t>
             </w:r>
           </w:p>
         </w:tc>
@@ -13643,7 +13865,7 @@
                 <w:sz w:val="16"/>
                 <w:szCs w:val="16"/>
               </w:rPr>
-              <w:t xml:space="preserve">Invoice Settings</w:t>
+              <w:t xml:space="preserve">AI Executive Copilot</w:t>
             </w:r>
           </w:p>
         </w:tc>
@@ -13793,7 +14015,7 @@
                 <w:sz w:val="16"/>
                 <w:szCs w:val="16"/>
               </w:rPr>
-              <w:t xml:space="preserve">✓</w:t>
+              <w:t xml:space="preserve">–</w:t>
             </w:r>
           </w:p>
         </w:tc>
@@ -13895,7 +14117,7 @@
                 <w:sz w:val="16"/>
                 <w:szCs w:val="16"/>
               </w:rPr>
-              <w:t xml:space="preserve">Survey Results</w:t>
+              <w:t xml:space="preserve">Top Performers</w:t>
             </w:r>
           </w:p>
         </w:tc>
@@ -13970,132 +14192,132 @@
                 <w:sz w:val="16"/>
                 <w:szCs w:val="16"/>
               </w:rPr>
+              <w:t xml:space="preserve">–</w:t>
+            </w:r>
+          </w:p>
+        </w:tc>
+        <w:tc>
+          <w:tcPr>
+            <w:tcW w:type="pct" w:w="8.666666666666666%"/>
+            <w:shd w:fill="F1F5F9" w:color="auto" w:val="clear"/>
+            <w:tcMar>
+              <w:top w:type="dxa" w:w="60"/>
+              <w:left w:type="dxa" w:w="80"/>
+              <w:bottom w:type="dxa" w:w="60"/>
+              <w:right w:type="dxa" w:w="80"/>
+            </w:tcMar>
+          </w:tcPr>
+          <w:p>
+            <w:pPr>
+              <w:jc w:val="center"/>
+            </w:pPr>
+            <w:r>
+              <w:rPr>
+                <w:rFonts w:ascii="Calibri" w:cs="Calibri" w:eastAsia="Calibri" w:hAnsi="Calibri"/>
+                <w:sz w:val="16"/>
+                <w:szCs w:val="16"/>
+              </w:rPr>
+              <w:t xml:space="preserve">–</w:t>
+            </w:r>
+          </w:p>
+        </w:tc>
+        <w:tc>
+          <w:tcPr>
+            <w:tcW w:type="pct" w:w="8.666666666666666%"/>
+            <w:shd w:fill="F1F5F9" w:color="auto" w:val="clear"/>
+            <w:tcMar>
+              <w:top w:type="dxa" w:w="60"/>
+              <w:left w:type="dxa" w:w="80"/>
+              <w:bottom w:type="dxa" w:w="60"/>
+              <w:right w:type="dxa" w:w="80"/>
+            </w:tcMar>
+          </w:tcPr>
+          <w:p>
+            <w:pPr>
+              <w:jc w:val="center"/>
+            </w:pPr>
+            <w:r>
+              <w:rPr>
+                <w:rFonts w:ascii="Calibri" w:cs="Calibri" w:eastAsia="Calibri" w:hAnsi="Calibri"/>
+                <w:sz w:val="16"/>
+                <w:szCs w:val="16"/>
+              </w:rPr>
+              <w:t xml:space="preserve">–</w:t>
+            </w:r>
+          </w:p>
+        </w:tc>
+        <w:tc>
+          <w:tcPr>
+            <w:tcW w:type="pct" w:w="8.666666666666666%"/>
+            <w:shd w:fill="F1F5F9" w:color="auto" w:val="clear"/>
+            <w:tcMar>
+              <w:top w:type="dxa" w:w="60"/>
+              <w:left w:type="dxa" w:w="80"/>
+              <w:bottom w:type="dxa" w:w="60"/>
+              <w:right w:type="dxa" w:w="80"/>
+            </w:tcMar>
+          </w:tcPr>
+          <w:p>
+            <w:pPr>
+              <w:jc w:val="center"/>
+            </w:pPr>
+            <w:r>
+              <w:rPr>
+                <w:rFonts w:ascii="Calibri" w:cs="Calibri" w:eastAsia="Calibri" w:hAnsi="Calibri"/>
+                <w:sz w:val="16"/>
+                <w:szCs w:val="16"/>
+              </w:rPr>
+              <w:t xml:space="preserve">–</w:t>
+            </w:r>
+          </w:p>
+        </w:tc>
+        <w:tc>
+          <w:tcPr>
+            <w:tcW w:type="pct" w:w="8.666666666666666%"/>
+            <w:shd w:fill="F1F5F9" w:color="auto" w:val="clear"/>
+            <w:tcMar>
+              <w:top w:type="dxa" w:w="60"/>
+              <w:left w:type="dxa" w:w="80"/>
+              <w:bottom w:type="dxa" w:w="60"/>
+              <w:right w:type="dxa" w:w="80"/>
+            </w:tcMar>
+          </w:tcPr>
+          <w:p>
+            <w:pPr>
+              <w:jc w:val="center"/>
+            </w:pPr>
+            <w:r>
+              <w:rPr>
+                <w:rFonts w:ascii="Calibri" w:cs="Calibri" w:eastAsia="Calibri" w:hAnsi="Calibri"/>
+                <w:sz w:val="16"/>
+                <w:szCs w:val="16"/>
+              </w:rPr>
+              <w:t xml:space="preserve">–</w:t>
+            </w:r>
+          </w:p>
+        </w:tc>
+        <w:tc>
+          <w:tcPr>
+            <w:tcW w:type="pct" w:w="8.666666666666666%"/>
+            <w:shd w:fill="F1F5F9" w:color="auto" w:val="clear"/>
+            <w:tcMar>
+              <w:top w:type="dxa" w:w="60"/>
+              <w:left w:type="dxa" w:w="80"/>
+              <w:bottom w:type="dxa" w:w="60"/>
+              <w:right w:type="dxa" w:w="80"/>
+            </w:tcMar>
+          </w:tcPr>
+          <w:p>
+            <w:pPr>
+              <w:jc w:val="center"/>
+            </w:pPr>
+            <w:r>
+              <w:rPr>
+                <w:rFonts w:ascii="Calibri" w:cs="Calibri" w:eastAsia="Calibri" w:hAnsi="Calibri"/>
+                <w:sz w:val="16"/>
+                <w:szCs w:val="16"/>
+              </w:rPr>
               <w:t xml:space="preserve">✓</w:t>
-            </w:r>
-          </w:p>
-        </w:tc>
-        <w:tc>
-          <w:tcPr>
-            <w:tcW w:type="pct" w:w="8.666666666666666%"/>
-            <w:shd w:fill="F1F5F9" w:color="auto" w:val="clear"/>
-            <w:tcMar>
-              <w:top w:type="dxa" w:w="60"/>
-              <w:left w:type="dxa" w:w="80"/>
-              <w:bottom w:type="dxa" w:w="60"/>
-              <w:right w:type="dxa" w:w="80"/>
-            </w:tcMar>
-          </w:tcPr>
-          <w:p>
-            <w:pPr>
-              <w:jc w:val="center"/>
-            </w:pPr>
-            <w:r>
-              <w:rPr>
-                <w:rFonts w:ascii="Calibri" w:cs="Calibri" w:eastAsia="Calibri" w:hAnsi="Calibri"/>
-                <w:sz w:val="16"/>
-                <w:szCs w:val="16"/>
-              </w:rPr>
-              <w:t xml:space="preserve">–</w:t>
-            </w:r>
-          </w:p>
-        </w:tc>
-        <w:tc>
-          <w:tcPr>
-            <w:tcW w:type="pct" w:w="8.666666666666666%"/>
-            <w:shd w:fill="F1F5F9" w:color="auto" w:val="clear"/>
-            <w:tcMar>
-              <w:top w:type="dxa" w:w="60"/>
-              <w:left w:type="dxa" w:w="80"/>
-              <w:bottom w:type="dxa" w:w="60"/>
-              <w:right w:type="dxa" w:w="80"/>
-            </w:tcMar>
-          </w:tcPr>
-          <w:p>
-            <w:pPr>
-              <w:jc w:val="center"/>
-            </w:pPr>
-            <w:r>
-              <w:rPr>
-                <w:rFonts w:ascii="Calibri" w:cs="Calibri" w:eastAsia="Calibri" w:hAnsi="Calibri"/>
-                <w:sz w:val="16"/>
-                <w:szCs w:val="16"/>
-              </w:rPr>
-              <w:t xml:space="preserve">–</w:t>
-            </w:r>
-          </w:p>
-        </w:tc>
-        <w:tc>
-          <w:tcPr>
-            <w:tcW w:type="pct" w:w="8.666666666666666%"/>
-            <w:shd w:fill="F1F5F9" w:color="auto" w:val="clear"/>
-            <w:tcMar>
-              <w:top w:type="dxa" w:w="60"/>
-              <w:left w:type="dxa" w:w="80"/>
-              <w:bottom w:type="dxa" w:w="60"/>
-              <w:right w:type="dxa" w:w="80"/>
-            </w:tcMar>
-          </w:tcPr>
-          <w:p>
-            <w:pPr>
-              <w:jc w:val="center"/>
-            </w:pPr>
-            <w:r>
-              <w:rPr>
-                <w:rFonts w:ascii="Calibri" w:cs="Calibri" w:eastAsia="Calibri" w:hAnsi="Calibri"/>
-                <w:sz w:val="16"/>
-                <w:szCs w:val="16"/>
-              </w:rPr>
-              <w:t xml:space="preserve">–</w:t>
-            </w:r>
-          </w:p>
-        </w:tc>
-        <w:tc>
-          <w:tcPr>
-            <w:tcW w:type="pct" w:w="8.666666666666666%"/>
-            <w:shd w:fill="F1F5F9" w:color="auto" w:val="clear"/>
-            <w:tcMar>
-              <w:top w:type="dxa" w:w="60"/>
-              <w:left w:type="dxa" w:w="80"/>
-              <w:bottom w:type="dxa" w:w="60"/>
-              <w:right w:type="dxa" w:w="80"/>
-            </w:tcMar>
-          </w:tcPr>
-          <w:p>
-            <w:pPr>
-              <w:jc w:val="center"/>
-            </w:pPr>
-            <w:r>
-              <w:rPr>
-                <w:rFonts w:ascii="Calibri" w:cs="Calibri" w:eastAsia="Calibri" w:hAnsi="Calibri"/>
-                <w:sz w:val="16"/>
-                <w:szCs w:val="16"/>
-              </w:rPr>
-              <w:t xml:space="preserve">–</w:t>
-            </w:r>
-          </w:p>
-        </w:tc>
-        <w:tc>
-          <w:tcPr>
-            <w:tcW w:type="pct" w:w="8.666666666666666%"/>
-            <w:shd w:fill="F1F5F9" w:color="auto" w:val="clear"/>
-            <w:tcMar>
-              <w:top w:type="dxa" w:w="60"/>
-              <w:left w:type="dxa" w:w="80"/>
-              <w:bottom w:type="dxa" w:w="60"/>
-              <w:right w:type="dxa" w:w="80"/>
-            </w:tcMar>
-          </w:tcPr>
-          <w:p>
-            <w:pPr>
-              <w:jc w:val="center"/>
-            </w:pPr>
-            <w:r>
-              <w:rPr>
-                <w:rFonts w:ascii="Calibri" w:cs="Calibri" w:eastAsia="Calibri" w:hAnsi="Calibri"/>
-                <w:sz w:val="16"/>
-                <w:szCs w:val="16"/>
-              </w:rPr>
-              <w:t xml:space="preserve">–</w:t>
             </w:r>
           </w:p>
         </w:tc>
@@ -14147,7 +14369,7 @@
                 <w:sz w:val="16"/>
                 <w:szCs w:val="16"/>
               </w:rPr>
-              <w:t xml:space="preserve">Survey Template</w:t>
+              <w:t xml:space="preserve">VAT Recap</w:t>
             </w:r>
           </w:p>
         </w:tc>
@@ -14297,7 +14519,7 @@
                 <w:sz w:val="16"/>
                 <w:szCs w:val="16"/>
               </w:rPr>
-              <w:t xml:space="preserve">–</w:t>
+              <w:t xml:space="preserve">✓</w:t>
             </w:r>
           </w:p>
         </w:tc>
@@ -14399,207 +14621,7 @@
                 <w:sz w:val="16"/>
                 <w:szCs w:val="16"/>
               </w:rPr>
-              <w:t xml:space="preserve">Audit Log</w:t>
-            </w:r>
-          </w:p>
-        </w:tc>
-        <w:tc>
-          <w:tcPr>
-            <w:tcW w:type="pct" w:w="8.666666666666666%"/>
-            <w:shd w:fill="F1F5F9" w:color="auto" w:val="clear"/>
-            <w:tcMar>
-              <w:top w:type="dxa" w:w="60"/>
-              <w:left w:type="dxa" w:w="80"/>
-              <w:bottom w:type="dxa" w:w="60"/>
-              <w:right w:type="dxa" w:w="80"/>
-            </w:tcMar>
-          </w:tcPr>
-          <w:p>
-            <w:pPr>
-              <w:jc w:val="center"/>
-            </w:pPr>
-            <w:r>
-              <w:rPr>
-                <w:rFonts w:ascii="Calibri" w:cs="Calibri" w:eastAsia="Calibri" w:hAnsi="Calibri"/>
-                <w:sz w:val="16"/>
-                <w:szCs w:val="16"/>
-              </w:rPr>
-              <w:t xml:space="preserve">–</w:t>
-            </w:r>
-          </w:p>
-        </w:tc>
-        <w:tc>
-          <w:tcPr>
-            <w:tcW w:type="pct" w:w="8.666666666666666%"/>
-            <w:shd w:fill="F1F5F9" w:color="auto" w:val="clear"/>
-            <w:tcMar>
-              <w:top w:type="dxa" w:w="60"/>
-              <w:left w:type="dxa" w:w="80"/>
-              <w:bottom w:type="dxa" w:w="60"/>
-              <w:right w:type="dxa" w:w="80"/>
-            </w:tcMar>
-          </w:tcPr>
-          <w:p>
-            <w:pPr>
-              <w:jc w:val="center"/>
-            </w:pPr>
-            <w:r>
-              <w:rPr>
-                <w:rFonts w:ascii="Calibri" w:cs="Calibri" w:eastAsia="Calibri" w:hAnsi="Calibri"/>
-                <w:sz w:val="16"/>
-                <w:szCs w:val="16"/>
-              </w:rPr>
-              <w:t xml:space="preserve">–</w:t>
-            </w:r>
-          </w:p>
-        </w:tc>
-        <w:tc>
-          <w:tcPr>
-            <w:tcW w:type="pct" w:w="8.666666666666666%"/>
-            <w:shd w:fill="F1F5F9" w:color="auto" w:val="clear"/>
-            <w:tcMar>
-              <w:top w:type="dxa" w:w="60"/>
-              <w:left w:type="dxa" w:w="80"/>
-              <w:bottom w:type="dxa" w:w="60"/>
-              <w:right w:type="dxa" w:w="80"/>
-            </w:tcMar>
-          </w:tcPr>
-          <w:p>
-            <w:pPr>
-              <w:jc w:val="center"/>
-            </w:pPr>
-            <w:r>
-              <w:rPr>
-                <w:rFonts w:ascii="Calibri" w:cs="Calibri" w:eastAsia="Calibri" w:hAnsi="Calibri"/>
-                <w:sz w:val="16"/>
-                <w:szCs w:val="16"/>
-              </w:rPr>
-              <w:t xml:space="preserve">–</w:t>
-            </w:r>
-          </w:p>
-        </w:tc>
-        <w:tc>
-          <w:tcPr>
-            <w:tcW w:type="pct" w:w="8.666666666666666%"/>
-            <w:shd w:fill="F1F5F9" w:color="auto" w:val="clear"/>
-            <w:tcMar>
-              <w:top w:type="dxa" w:w="60"/>
-              <w:left w:type="dxa" w:w="80"/>
-              <w:bottom w:type="dxa" w:w="60"/>
-              <w:right w:type="dxa" w:w="80"/>
-            </w:tcMar>
-          </w:tcPr>
-          <w:p>
-            <w:pPr>
-              <w:jc w:val="center"/>
-            </w:pPr>
-            <w:r>
-              <w:rPr>
-                <w:rFonts w:ascii="Calibri" w:cs="Calibri" w:eastAsia="Calibri" w:hAnsi="Calibri"/>
-                <w:sz w:val="16"/>
-                <w:szCs w:val="16"/>
-              </w:rPr>
-              <w:t xml:space="preserve">–</w:t>
-            </w:r>
-          </w:p>
-        </w:tc>
-        <w:tc>
-          <w:tcPr>
-            <w:tcW w:type="pct" w:w="8.666666666666666%"/>
-            <w:shd w:fill="F1F5F9" w:color="auto" w:val="clear"/>
-            <w:tcMar>
-              <w:top w:type="dxa" w:w="60"/>
-              <w:left w:type="dxa" w:w="80"/>
-              <w:bottom w:type="dxa" w:w="60"/>
-              <w:right w:type="dxa" w:w="80"/>
-            </w:tcMar>
-          </w:tcPr>
-          <w:p>
-            <w:pPr>
-              <w:jc w:val="center"/>
-            </w:pPr>
-            <w:r>
-              <w:rPr>
-                <w:rFonts w:ascii="Calibri" w:cs="Calibri" w:eastAsia="Calibri" w:hAnsi="Calibri"/>
-                <w:sz w:val="16"/>
-                <w:szCs w:val="16"/>
-              </w:rPr>
-              <w:t xml:space="preserve">–</w:t>
-            </w:r>
-          </w:p>
-        </w:tc>
-        <w:tc>
-          <w:tcPr>
-            <w:tcW w:type="pct" w:w="8.666666666666666%"/>
-            <w:shd w:fill="F1F5F9" w:color="auto" w:val="clear"/>
-            <w:tcMar>
-              <w:top w:type="dxa" w:w="60"/>
-              <w:left w:type="dxa" w:w="80"/>
-              <w:bottom w:type="dxa" w:w="60"/>
-              <w:right w:type="dxa" w:w="80"/>
-            </w:tcMar>
-          </w:tcPr>
-          <w:p>
-            <w:pPr>
-              <w:jc w:val="center"/>
-            </w:pPr>
-            <w:r>
-              <w:rPr>
-                <w:rFonts w:ascii="Calibri" w:cs="Calibri" w:eastAsia="Calibri" w:hAnsi="Calibri"/>
-                <w:sz w:val="16"/>
-                <w:szCs w:val="16"/>
-              </w:rPr>
-              <w:t xml:space="preserve">–</w:t>
-            </w:r>
-          </w:p>
-        </w:tc>
-        <w:tc>
-          <w:tcPr>
-            <w:tcW w:type="pct" w:w="8.666666666666666%"/>
-            <w:shd w:fill="F1F5F9" w:color="auto" w:val="clear"/>
-            <w:tcMar>
-              <w:top w:type="dxa" w:w="60"/>
-              <w:left w:type="dxa" w:w="80"/>
-              <w:bottom w:type="dxa" w:w="60"/>
-              <w:right w:type="dxa" w:w="80"/>
-            </w:tcMar>
-          </w:tcPr>
-          <w:p>
-            <w:pPr>
-              <w:jc w:val="center"/>
-            </w:pPr>
-            <w:r>
-              <w:rPr>
-                <w:rFonts w:ascii="Calibri" w:cs="Calibri" w:eastAsia="Calibri" w:hAnsi="Calibri"/>
-                <w:sz w:val="16"/>
-                <w:szCs w:val="16"/>
-              </w:rPr>
-              <w:t xml:space="preserve">–</w:t>
-            </w:r>
-          </w:p>
-        </w:tc>
-        <w:tc>
-          <w:tcPr>
-            <w:tcW w:type="pct" w:w="8.666666666666666%"/>
-            <w:shd w:fill="F1F5F9" w:color="auto" w:val="clear"/>
-            <w:tcMar>
-              <w:top w:type="dxa" w:w="60"/>
-              <w:left w:type="dxa" w:w="80"/>
-              <w:bottom w:type="dxa" w:w="60"/>
-              <w:right w:type="dxa" w:w="80"/>
-            </w:tcMar>
-          </w:tcPr>
-          <w:p>
-            <w:pPr>
-              <w:jc w:val="center"/>
-            </w:pPr>
-            <w:r>
-              <w:rPr>
-                <w:rFonts w:ascii="Calibri" w:cs="Calibri" w:eastAsia="Calibri" w:hAnsi="Calibri"/>
-                <w:sz w:val="16"/>
-                <w:szCs w:val="16"/>
-              </w:rPr>
-              <w:t xml:space="preserve">–</w:t>
+              <w:t xml:space="preserve">Invoice Settings</w:t>
             </w:r>
           </w:p>
         </w:tc>
@@ -14625,6 +14647,206 @@
                 <w:szCs w:val="16"/>
               </w:rPr>
               <w:t xml:space="preserve">✓</w:t>
+            </w:r>
+          </w:p>
+        </w:tc>
+        <w:tc>
+          <w:tcPr>
+            <w:tcW w:type="pct" w:w="8.666666666666666%"/>
+            <w:shd w:fill="F1F5F9" w:color="auto" w:val="clear"/>
+            <w:tcMar>
+              <w:top w:type="dxa" w:w="60"/>
+              <w:left w:type="dxa" w:w="80"/>
+              <w:bottom w:type="dxa" w:w="60"/>
+              <w:right w:type="dxa" w:w="80"/>
+            </w:tcMar>
+          </w:tcPr>
+          <w:p>
+            <w:pPr>
+              <w:jc w:val="center"/>
+            </w:pPr>
+            <w:r>
+              <w:rPr>
+                <w:rFonts w:ascii="Calibri" w:cs="Calibri" w:eastAsia="Calibri" w:hAnsi="Calibri"/>
+                <w:sz w:val="16"/>
+                <w:szCs w:val="16"/>
+              </w:rPr>
+              <w:t xml:space="preserve">–</w:t>
+            </w:r>
+          </w:p>
+        </w:tc>
+        <w:tc>
+          <w:tcPr>
+            <w:tcW w:type="pct" w:w="8.666666666666666%"/>
+            <w:shd w:fill="F1F5F9" w:color="auto" w:val="clear"/>
+            <w:tcMar>
+              <w:top w:type="dxa" w:w="60"/>
+              <w:left w:type="dxa" w:w="80"/>
+              <w:bottom w:type="dxa" w:w="60"/>
+              <w:right w:type="dxa" w:w="80"/>
+            </w:tcMar>
+          </w:tcPr>
+          <w:p>
+            <w:pPr>
+              <w:jc w:val="center"/>
+            </w:pPr>
+            <w:r>
+              <w:rPr>
+                <w:rFonts w:ascii="Calibri" w:cs="Calibri" w:eastAsia="Calibri" w:hAnsi="Calibri"/>
+                <w:sz w:val="16"/>
+                <w:szCs w:val="16"/>
+              </w:rPr>
+              <w:t xml:space="preserve">–</w:t>
+            </w:r>
+          </w:p>
+        </w:tc>
+        <w:tc>
+          <w:tcPr>
+            <w:tcW w:type="pct" w:w="8.666666666666666%"/>
+            <w:shd w:fill="F1F5F9" w:color="auto" w:val="clear"/>
+            <w:tcMar>
+              <w:top w:type="dxa" w:w="60"/>
+              <w:left w:type="dxa" w:w="80"/>
+              <w:bottom w:type="dxa" w:w="60"/>
+              <w:right w:type="dxa" w:w="80"/>
+            </w:tcMar>
+          </w:tcPr>
+          <w:p>
+            <w:pPr>
+              <w:jc w:val="center"/>
+            </w:pPr>
+            <w:r>
+              <w:rPr>
+                <w:rFonts w:ascii="Calibri" w:cs="Calibri" w:eastAsia="Calibri" w:hAnsi="Calibri"/>
+                <w:sz w:val="16"/>
+                <w:szCs w:val="16"/>
+              </w:rPr>
+              <w:t xml:space="preserve">–</w:t>
+            </w:r>
+          </w:p>
+        </w:tc>
+        <w:tc>
+          <w:tcPr>
+            <w:tcW w:type="pct" w:w="8.666666666666666%"/>
+            <w:shd w:fill="F1F5F9" w:color="auto" w:val="clear"/>
+            <w:tcMar>
+              <w:top w:type="dxa" w:w="60"/>
+              <w:left w:type="dxa" w:w="80"/>
+              <w:bottom w:type="dxa" w:w="60"/>
+              <w:right w:type="dxa" w:w="80"/>
+            </w:tcMar>
+          </w:tcPr>
+          <w:p>
+            <w:pPr>
+              <w:jc w:val="center"/>
+            </w:pPr>
+            <w:r>
+              <w:rPr>
+                <w:rFonts w:ascii="Calibri" w:cs="Calibri" w:eastAsia="Calibri" w:hAnsi="Calibri"/>
+                <w:sz w:val="16"/>
+                <w:szCs w:val="16"/>
+              </w:rPr>
+              <w:t xml:space="preserve">–</w:t>
+            </w:r>
+          </w:p>
+        </w:tc>
+        <w:tc>
+          <w:tcPr>
+            <w:tcW w:type="pct" w:w="8.666666666666666%"/>
+            <w:shd w:fill="F1F5F9" w:color="auto" w:val="clear"/>
+            <w:tcMar>
+              <w:top w:type="dxa" w:w="60"/>
+              <w:left w:type="dxa" w:w="80"/>
+              <w:bottom w:type="dxa" w:w="60"/>
+              <w:right w:type="dxa" w:w="80"/>
+            </w:tcMar>
+          </w:tcPr>
+          <w:p>
+            <w:pPr>
+              <w:jc w:val="center"/>
+            </w:pPr>
+            <w:r>
+              <w:rPr>
+                <w:rFonts w:ascii="Calibri" w:cs="Calibri" w:eastAsia="Calibri" w:hAnsi="Calibri"/>
+                <w:sz w:val="16"/>
+                <w:szCs w:val="16"/>
+              </w:rPr>
+              <w:t xml:space="preserve">✓</w:t>
+            </w:r>
+          </w:p>
+        </w:tc>
+        <w:tc>
+          <w:tcPr>
+            <w:tcW w:type="pct" w:w="8.666666666666666%"/>
+            <w:shd w:fill="F1F5F9" w:color="auto" w:val="clear"/>
+            <w:tcMar>
+              <w:top w:type="dxa" w:w="60"/>
+              <w:left w:type="dxa" w:w="80"/>
+              <w:bottom w:type="dxa" w:w="60"/>
+              <w:right w:type="dxa" w:w="80"/>
+            </w:tcMar>
+          </w:tcPr>
+          <w:p>
+            <w:pPr>
+              <w:jc w:val="center"/>
+            </w:pPr>
+            <w:r>
+              <w:rPr>
+                <w:rFonts w:ascii="Calibri" w:cs="Calibri" w:eastAsia="Calibri" w:hAnsi="Calibri"/>
+                <w:sz w:val="16"/>
+                <w:szCs w:val="16"/>
+              </w:rPr>
+              <w:t xml:space="preserve">–</w:t>
+            </w:r>
+          </w:p>
+        </w:tc>
+        <w:tc>
+          <w:tcPr>
+            <w:tcW w:type="pct" w:w="8.666666666666666%"/>
+            <w:shd w:fill="F1F5F9" w:color="auto" w:val="clear"/>
+            <w:tcMar>
+              <w:top w:type="dxa" w:w="60"/>
+              <w:left w:type="dxa" w:w="80"/>
+              <w:bottom w:type="dxa" w:w="60"/>
+              <w:right w:type="dxa" w:w="80"/>
+            </w:tcMar>
+          </w:tcPr>
+          <w:p>
+            <w:pPr>
+              <w:jc w:val="center"/>
+            </w:pPr>
+            <w:r>
+              <w:rPr>
+                <w:rFonts w:ascii="Calibri" w:cs="Calibri" w:eastAsia="Calibri" w:hAnsi="Calibri"/>
+                <w:sz w:val="16"/>
+                <w:szCs w:val="16"/>
+              </w:rPr>
+              <w:t xml:space="preserve">–</w:t>
+            </w:r>
+          </w:p>
+        </w:tc>
+        <w:tc>
+          <w:tcPr>
+            <w:tcW w:type="pct" w:w="8.666666666666666%"/>
+            <w:shd w:fill="F1F5F9" w:color="auto" w:val="clear"/>
+            <w:tcMar>
+              <w:top w:type="dxa" w:w="60"/>
+              <w:left w:type="dxa" w:w="80"/>
+              <w:bottom w:type="dxa" w:w="60"/>
+              <w:right w:type="dxa" w:w="80"/>
+            </w:tcMar>
+          </w:tcPr>
+          <w:p>
+            <w:pPr>
+              <w:jc w:val="center"/>
+            </w:pPr>
+            <w:r>
+              <w:rPr>
+                <w:rFonts w:ascii="Calibri" w:cs="Calibri" w:eastAsia="Calibri" w:hAnsi="Calibri"/>
+                <w:sz w:val="16"/>
+                <w:szCs w:val="16"/>
+              </w:rPr>
+              <w:t xml:space="preserve">–</w:t>
             </w:r>
           </w:p>
         </w:tc>
@@ -14651,7 +14873,7 @@
                 <w:sz w:val="16"/>
                 <w:szCs w:val="16"/>
               </w:rPr>
-              <w:t xml:space="preserve">Settings</w:t>
+              <w:t xml:space="preserve">Survey Results</w:t>
             </w:r>
           </w:p>
         </w:tc>
@@ -14701,6 +14923,31 @@
                 <w:sz w:val="16"/>
                 <w:szCs w:val="16"/>
               </w:rPr>
+              <w:t xml:space="preserve">–</w:t>
+            </w:r>
+          </w:p>
+        </w:tc>
+        <w:tc>
+          <w:tcPr>
+            <w:tcW w:type="pct" w:w="8.666666666666666%"/>
+            <w:shd w:fill="FFFFFF" w:color="auto" w:val="clear"/>
+            <w:tcMar>
+              <w:top w:type="dxa" w:w="60"/>
+              <w:left w:type="dxa" w:w="80"/>
+              <w:bottom w:type="dxa" w:w="60"/>
+              <w:right w:type="dxa" w:w="80"/>
+            </w:tcMar>
+          </w:tcPr>
+          <w:p>
+            <w:pPr>
+              <w:jc w:val="center"/>
+            </w:pPr>
+            <w:r>
+              <w:rPr>
+                <w:rFonts w:ascii="Calibri" w:cs="Calibri" w:eastAsia="Calibri" w:hAnsi="Calibri"/>
+                <w:sz w:val="16"/>
+                <w:szCs w:val="16"/>
+              </w:rPr>
               <w:t xml:space="preserve">✓</w:t>
             </w:r>
           </w:p>
@@ -14726,157 +14973,132 @@
                 <w:sz w:val="16"/>
                 <w:szCs w:val="16"/>
               </w:rPr>
-              <w:t xml:space="preserve">✓</w:t>
-            </w:r>
-          </w:p>
-        </w:tc>
-        <w:tc>
-          <w:tcPr>
-            <w:tcW w:type="pct" w:w="8.666666666666666%"/>
-            <w:shd w:fill="FFFFFF" w:color="auto" w:val="clear"/>
-            <w:tcMar>
-              <w:top w:type="dxa" w:w="60"/>
-              <w:left w:type="dxa" w:w="80"/>
-              <w:bottom w:type="dxa" w:w="60"/>
-              <w:right w:type="dxa" w:w="80"/>
-            </w:tcMar>
-          </w:tcPr>
-          <w:p>
-            <w:pPr>
-              <w:jc w:val="center"/>
-            </w:pPr>
-            <w:r>
-              <w:rPr>
-                <w:rFonts w:ascii="Calibri" w:cs="Calibri" w:eastAsia="Calibri" w:hAnsi="Calibri"/>
-                <w:sz w:val="16"/>
-                <w:szCs w:val="16"/>
-              </w:rPr>
-              <w:t xml:space="preserve">✓</w:t>
-            </w:r>
-          </w:p>
-        </w:tc>
-        <w:tc>
-          <w:tcPr>
-            <w:tcW w:type="pct" w:w="8.666666666666666%"/>
-            <w:shd w:fill="FFFFFF" w:color="auto" w:val="clear"/>
-            <w:tcMar>
-              <w:top w:type="dxa" w:w="60"/>
-              <w:left w:type="dxa" w:w="80"/>
-              <w:bottom w:type="dxa" w:w="60"/>
-              <w:right w:type="dxa" w:w="80"/>
-            </w:tcMar>
-          </w:tcPr>
-          <w:p>
-            <w:pPr>
-              <w:jc w:val="center"/>
-            </w:pPr>
-            <w:r>
-              <w:rPr>
-                <w:rFonts w:ascii="Calibri" w:cs="Calibri" w:eastAsia="Calibri" w:hAnsi="Calibri"/>
-                <w:sz w:val="16"/>
-                <w:szCs w:val="16"/>
-              </w:rPr>
-              <w:t xml:space="preserve">✓</w:t>
-            </w:r>
-          </w:p>
-        </w:tc>
-        <w:tc>
-          <w:tcPr>
-            <w:tcW w:type="pct" w:w="8.666666666666666%"/>
-            <w:shd w:fill="FFFFFF" w:color="auto" w:val="clear"/>
-            <w:tcMar>
-              <w:top w:type="dxa" w:w="60"/>
-              <w:left w:type="dxa" w:w="80"/>
-              <w:bottom w:type="dxa" w:w="60"/>
-              <w:right w:type="dxa" w:w="80"/>
-            </w:tcMar>
-          </w:tcPr>
-          <w:p>
-            <w:pPr>
-              <w:jc w:val="center"/>
-            </w:pPr>
-            <w:r>
-              <w:rPr>
-                <w:rFonts w:ascii="Calibri" w:cs="Calibri" w:eastAsia="Calibri" w:hAnsi="Calibri"/>
-                <w:sz w:val="16"/>
-                <w:szCs w:val="16"/>
-              </w:rPr>
-              <w:t xml:space="preserve">✓</w:t>
-            </w:r>
-          </w:p>
-        </w:tc>
-        <w:tc>
-          <w:tcPr>
-            <w:tcW w:type="pct" w:w="8.666666666666666%"/>
-            <w:shd w:fill="FFFFFF" w:color="auto" w:val="clear"/>
-            <w:tcMar>
-              <w:top w:type="dxa" w:w="60"/>
-              <w:left w:type="dxa" w:w="80"/>
-              <w:bottom w:type="dxa" w:w="60"/>
-              <w:right w:type="dxa" w:w="80"/>
-            </w:tcMar>
-          </w:tcPr>
-          <w:p>
-            <w:pPr>
-              <w:jc w:val="center"/>
-            </w:pPr>
-            <w:r>
-              <w:rPr>
-                <w:rFonts w:ascii="Calibri" w:cs="Calibri" w:eastAsia="Calibri" w:hAnsi="Calibri"/>
-                <w:sz w:val="16"/>
-                <w:szCs w:val="16"/>
-              </w:rPr>
-              <w:t xml:space="preserve">✓</w:t>
-            </w:r>
-          </w:p>
-        </w:tc>
-        <w:tc>
-          <w:tcPr>
-            <w:tcW w:type="pct" w:w="8.666666666666666%"/>
-            <w:shd w:fill="FFFFFF" w:color="auto" w:val="clear"/>
-            <w:tcMar>
-              <w:top w:type="dxa" w:w="60"/>
-              <w:left w:type="dxa" w:w="80"/>
-              <w:bottom w:type="dxa" w:w="60"/>
-              <w:right w:type="dxa" w:w="80"/>
-            </w:tcMar>
-          </w:tcPr>
-          <w:p>
-            <w:pPr>
-              <w:jc w:val="center"/>
-            </w:pPr>
-            <w:r>
-              <w:rPr>
-                <w:rFonts w:ascii="Calibri" w:cs="Calibri" w:eastAsia="Calibri" w:hAnsi="Calibri"/>
-                <w:sz w:val="16"/>
-                <w:szCs w:val="16"/>
-              </w:rPr>
-              <w:t xml:space="preserve">✓</w:t>
-            </w:r>
-          </w:p>
-        </w:tc>
-        <w:tc>
-          <w:tcPr>
-            <w:tcW w:type="pct" w:w="8.666666666666666%"/>
-            <w:shd w:fill="FFFFFF" w:color="auto" w:val="clear"/>
-            <w:tcMar>
-              <w:top w:type="dxa" w:w="60"/>
-              <w:left w:type="dxa" w:w="80"/>
-              <w:bottom w:type="dxa" w:w="60"/>
-              <w:right w:type="dxa" w:w="80"/>
-            </w:tcMar>
-          </w:tcPr>
-          <w:p>
-            <w:pPr>
-              <w:jc w:val="center"/>
-            </w:pPr>
-            <w:r>
-              <w:rPr>
-                <w:rFonts w:ascii="Calibri" w:cs="Calibri" w:eastAsia="Calibri" w:hAnsi="Calibri"/>
-                <w:sz w:val="16"/>
-                <w:szCs w:val="16"/>
-              </w:rPr>
-              <w:t xml:space="preserve">✓</w:t>
+              <w:t xml:space="preserve">–</w:t>
+            </w:r>
+          </w:p>
+        </w:tc>
+        <w:tc>
+          <w:tcPr>
+            <w:tcW w:type="pct" w:w="8.666666666666666%"/>
+            <w:shd w:fill="FFFFFF" w:color="auto" w:val="clear"/>
+            <w:tcMar>
+              <w:top w:type="dxa" w:w="60"/>
+              <w:left w:type="dxa" w:w="80"/>
+              <w:bottom w:type="dxa" w:w="60"/>
+              <w:right w:type="dxa" w:w="80"/>
+            </w:tcMar>
+          </w:tcPr>
+          <w:p>
+            <w:pPr>
+              <w:jc w:val="center"/>
+            </w:pPr>
+            <w:r>
+              <w:rPr>
+                <w:rFonts w:ascii="Calibri" w:cs="Calibri" w:eastAsia="Calibri" w:hAnsi="Calibri"/>
+                <w:sz w:val="16"/>
+                <w:szCs w:val="16"/>
+              </w:rPr>
+              <w:t xml:space="preserve">–</w:t>
+            </w:r>
+          </w:p>
+        </w:tc>
+        <w:tc>
+          <w:tcPr>
+            <w:tcW w:type="pct" w:w="8.666666666666666%"/>
+            <w:shd w:fill="FFFFFF" w:color="auto" w:val="clear"/>
+            <w:tcMar>
+              <w:top w:type="dxa" w:w="60"/>
+              <w:left w:type="dxa" w:w="80"/>
+              <w:bottom w:type="dxa" w:w="60"/>
+              <w:right w:type="dxa" w:w="80"/>
+            </w:tcMar>
+          </w:tcPr>
+          <w:p>
+            <w:pPr>
+              <w:jc w:val="center"/>
+            </w:pPr>
+            <w:r>
+              <w:rPr>
+                <w:rFonts w:ascii="Calibri" w:cs="Calibri" w:eastAsia="Calibri" w:hAnsi="Calibri"/>
+                <w:sz w:val="16"/>
+                <w:szCs w:val="16"/>
+              </w:rPr>
+              <w:t xml:space="preserve">–</w:t>
+            </w:r>
+          </w:p>
+        </w:tc>
+        <w:tc>
+          <w:tcPr>
+            <w:tcW w:type="pct" w:w="8.666666666666666%"/>
+            <w:shd w:fill="FFFFFF" w:color="auto" w:val="clear"/>
+            <w:tcMar>
+              <w:top w:type="dxa" w:w="60"/>
+              <w:left w:type="dxa" w:w="80"/>
+              <w:bottom w:type="dxa" w:w="60"/>
+              <w:right w:type="dxa" w:w="80"/>
+            </w:tcMar>
+          </w:tcPr>
+          <w:p>
+            <w:pPr>
+              <w:jc w:val="center"/>
+            </w:pPr>
+            <w:r>
+              <w:rPr>
+                <w:rFonts w:ascii="Calibri" w:cs="Calibri" w:eastAsia="Calibri" w:hAnsi="Calibri"/>
+                <w:sz w:val="16"/>
+                <w:szCs w:val="16"/>
+              </w:rPr>
+              <w:t xml:space="preserve">–</w:t>
+            </w:r>
+          </w:p>
+        </w:tc>
+        <w:tc>
+          <w:tcPr>
+            <w:tcW w:type="pct" w:w="8.666666666666666%"/>
+            <w:shd w:fill="FFFFFF" w:color="auto" w:val="clear"/>
+            <w:tcMar>
+              <w:top w:type="dxa" w:w="60"/>
+              <w:left w:type="dxa" w:w="80"/>
+              <w:bottom w:type="dxa" w:w="60"/>
+              <w:right w:type="dxa" w:w="80"/>
+            </w:tcMar>
+          </w:tcPr>
+          <w:p>
+            <w:pPr>
+              <w:jc w:val="center"/>
+            </w:pPr>
+            <w:r>
+              <w:rPr>
+                <w:rFonts w:ascii="Calibri" w:cs="Calibri" w:eastAsia="Calibri" w:hAnsi="Calibri"/>
+                <w:sz w:val="16"/>
+                <w:szCs w:val="16"/>
+              </w:rPr>
+              <w:t xml:space="preserve">–</w:t>
+            </w:r>
+          </w:p>
+        </w:tc>
+        <w:tc>
+          <w:tcPr>
+            <w:tcW w:type="pct" w:w="8.666666666666666%"/>
+            <w:shd w:fill="FFFFFF" w:color="auto" w:val="clear"/>
+            <w:tcMar>
+              <w:top w:type="dxa" w:w="60"/>
+              <w:left w:type="dxa" w:w="80"/>
+              <w:bottom w:type="dxa" w:w="60"/>
+              <w:right w:type="dxa" w:w="80"/>
+            </w:tcMar>
+          </w:tcPr>
+          <w:p>
+            <w:pPr>
+              <w:jc w:val="center"/>
+            </w:pPr>
+            <w:r>
+              <w:rPr>
+                <w:rFonts w:ascii="Calibri" w:cs="Calibri" w:eastAsia="Calibri" w:hAnsi="Calibri"/>
+                <w:sz w:val="16"/>
+                <w:szCs w:val="16"/>
+              </w:rPr>
+              <w:t xml:space="preserve">–</w:t>
             </w:r>
           </w:p>
         </w:tc>
@@ -14903,6 +15125,762 @@
                 <w:sz w:val="16"/>
                 <w:szCs w:val="16"/>
               </w:rPr>
+              <w:t xml:space="preserve">Survey Template</w:t>
+            </w:r>
+          </w:p>
+        </w:tc>
+        <w:tc>
+          <w:tcPr>
+            <w:tcW w:type="pct" w:w="8.666666666666666%"/>
+            <w:shd w:fill="F1F5F9" w:color="auto" w:val="clear"/>
+            <w:tcMar>
+              <w:top w:type="dxa" w:w="60"/>
+              <w:left w:type="dxa" w:w="80"/>
+              <w:bottom w:type="dxa" w:w="60"/>
+              <w:right w:type="dxa" w:w="80"/>
+            </w:tcMar>
+          </w:tcPr>
+          <w:p>
+            <w:pPr>
+              <w:jc w:val="center"/>
+            </w:pPr>
+            <w:r>
+              <w:rPr>
+                <w:rFonts w:ascii="Calibri" w:cs="Calibri" w:eastAsia="Calibri" w:hAnsi="Calibri"/>
+                <w:sz w:val="16"/>
+                <w:szCs w:val="16"/>
+              </w:rPr>
+              <w:t xml:space="preserve">✓</w:t>
+            </w:r>
+          </w:p>
+        </w:tc>
+        <w:tc>
+          <w:tcPr>
+            <w:tcW w:type="pct" w:w="8.666666666666666%"/>
+            <w:shd w:fill="F1F5F9" w:color="auto" w:val="clear"/>
+            <w:tcMar>
+              <w:top w:type="dxa" w:w="60"/>
+              <w:left w:type="dxa" w:w="80"/>
+              <w:bottom w:type="dxa" w:w="60"/>
+              <w:right w:type="dxa" w:w="80"/>
+            </w:tcMar>
+          </w:tcPr>
+          <w:p>
+            <w:pPr>
+              <w:jc w:val="center"/>
+            </w:pPr>
+            <w:r>
+              <w:rPr>
+                <w:rFonts w:ascii="Calibri" w:cs="Calibri" w:eastAsia="Calibri" w:hAnsi="Calibri"/>
+                <w:sz w:val="16"/>
+                <w:szCs w:val="16"/>
+              </w:rPr>
+              <w:t xml:space="preserve">–</w:t>
+            </w:r>
+          </w:p>
+        </w:tc>
+        <w:tc>
+          <w:tcPr>
+            <w:tcW w:type="pct" w:w="8.666666666666666%"/>
+            <w:shd w:fill="F1F5F9" w:color="auto" w:val="clear"/>
+            <w:tcMar>
+              <w:top w:type="dxa" w:w="60"/>
+              <w:left w:type="dxa" w:w="80"/>
+              <w:bottom w:type="dxa" w:w="60"/>
+              <w:right w:type="dxa" w:w="80"/>
+            </w:tcMar>
+          </w:tcPr>
+          <w:p>
+            <w:pPr>
+              <w:jc w:val="center"/>
+            </w:pPr>
+            <w:r>
+              <w:rPr>
+                <w:rFonts w:ascii="Calibri" w:cs="Calibri" w:eastAsia="Calibri" w:hAnsi="Calibri"/>
+                <w:sz w:val="16"/>
+                <w:szCs w:val="16"/>
+              </w:rPr>
+              <w:t xml:space="preserve">–</w:t>
+            </w:r>
+          </w:p>
+        </w:tc>
+        <w:tc>
+          <w:tcPr>
+            <w:tcW w:type="pct" w:w="8.666666666666666%"/>
+            <w:shd w:fill="F1F5F9" w:color="auto" w:val="clear"/>
+            <w:tcMar>
+              <w:top w:type="dxa" w:w="60"/>
+              <w:left w:type="dxa" w:w="80"/>
+              <w:bottom w:type="dxa" w:w="60"/>
+              <w:right w:type="dxa" w:w="80"/>
+            </w:tcMar>
+          </w:tcPr>
+          <w:p>
+            <w:pPr>
+              <w:jc w:val="center"/>
+            </w:pPr>
+            <w:r>
+              <w:rPr>
+                <w:rFonts w:ascii="Calibri" w:cs="Calibri" w:eastAsia="Calibri" w:hAnsi="Calibri"/>
+                <w:sz w:val="16"/>
+                <w:szCs w:val="16"/>
+              </w:rPr>
+              <w:t xml:space="preserve">–</w:t>
+            </w:r>
+          </w:p>
+        </w:tc>
+        <w:tc>
+          <w:tcPr>
+            <w:tcW w:type="pct" w:w="8.666666666666666%"/>
+            <w:shd w:fill="F1F5F9" w:color="auto" w:val="clear"/>
+            <w:tcMar>
+              <w:top w:type="dxa" w:w="60"/>
+              <w:left w:type="dxa" w:w="80"/>
+              <w:bottom w:type="dxa" w:w="60"/>
+              <w:right w:type="dxa" w:w="80"/>
+            </w:tcMar>
+          </w:tcPr>
+          <w:p>
+            <w:pPr>
+              <w:jc w:val="center"/>
+            </w:pPr>
+            <w:r>
+              <w:rPr>
+                <w:rFonts w:ascii="Calibri" w:cs="Calibri" w:eastAsia="Calibri" w:hAnsi="Calibri"/>
+                <w:sz w:val="16"/>
+                <w:szCs w:val="16"/>
+              </w:rPr>
+              <w:t xml:space="preserve">–</w:t>
+            </w:r>
+          </w:p>
+        </w:tc>
+        <w:tc>
+          <w:tcPr>
+            <w:tcW w:type="pct" w:w="8.666666666666666%"/>
+            <w:shd w:fill="F1F5F9" w:color="auto" w:val="clear"/>
+            <w:tcMar>
+              <w:top w:type="dxa" w:w="60"/>
+              <w:left w:type="dxa" w:w="80"/>
+              <w:bottom w:type="dxa" w:w="60"/>
+              <w:right w:type="dxa" w:w="80"/>
+            </w:tcMar>
+          </w:tcPr>
+          <w:p>
+            <w:pPr>
+              <w:jc w:val="center"/>
+            </w:pPr>
+            <w:r>
+              <w:rPr>
+                <w:rFonts w:ascii="Calibri" w:cs="Calibri" w:eastAsia="Calibri" w:hAnsi="Calibri"/>
+                <w:sz w:val="16"/>
+                <w:szCs w:val="16"/>
+              </w:rPr>
+              <w:t xml:space="preserve">–</w:t>
+            </w:r>
+          </w:p>
+        </w:tc>
+        <w:tc>
+          <w:tcPr>
+            <w:tcW w:type="pct" w:w="8.666666666666666%"/>
+            <w:shd w:fill="F1F5F9" w:color="auto" w:val="clear"/>
+            <w:tcMar>
+              <w:top w:type="dxa" w:w="60"/>
+              <w:left w:type="dxa" w:w="80"/>
+              <w:bottom w:type="dxa" w:w="60"/>
+              <w:right w:type="dxa" w:w="80"/>
+            </w:tcMar>
+          </w:tcPr>
+          <w:p>
+            <w:pPr>
+              <w:jc w:val="center"/>
+            </w:pPr>
+            <w:r>
+              <w:rPr>
+                <w:rFonts w:ascii="Calibri" w:cs="Calibri" w:eastAsia="Calibri" w:hAnsi="Calibri"/>
+                <w:sz w:val="16"/>
+                <w:szCs w:val="16"/>
+              </w:rPr>
+              <w:t xml:space="preserve">–</w:t>
+            </w:r>
+          </w:p>
+        </w:tc>
+        <w:tc>
+          <w:tcPr>
+            <w:tcW w:type="pct" w:w="8.666666666666666%"/>
+            <w:shd w:fill="F1F5F9" w:color="auto" w:val="clear"/>
+            <w:tcMar>
+              <w:top w:type="dxa" w:w="60"/>
+              <w:left w:type="dxa" w:w="80"/>
+              <w:bottom w:type="dxa" w:w="60"/>
+              <w:right w:type="dxa" w:w="80"/>
+            </w:tcMar>
+          </w:tcPr>
+          <w:p>
+            <w:pPr>
+              <w:jc w:val="center"/>
+            </w:pPr>
+            <w:r>
+              <w:rPr>
+                <w:rFonts w:ascii="Calibri" w:cs="Calibri" w:eastAsia="Calibri" w:hAnsi="Calibri"/>
+                <w:sz w:val="16"/>
+                <w:szCs w:val="16"/>
+              </w:rPr>
+              <w:t xml:space="preserve">–</w:t>
+            </w:r>
+          </w:p>
+        </w:tc>
+        <w:tc>
+          <w:tcPr>
+            <w:tcW w:type="pct" w:w="8.666666666666666%"/>
+            <w:shd w:fill="F1F5F9" w:color="auto" w:val="clear"/>
+            <w:tcMar>
+              <w:top w:type="dxa" w:w="60"/>
+              <w:left w:type="dxa" w:w="80"/>
+              <w:bottom w:type="dxa" w:w="60"/>
+              <w:right w:type="dxa" w:w="80"/>
+            </w:tcMar>
+          </w:tcPr>
+          <w:p>
+            <w:pPr>
+              <w:jc w:val="center"/>
+            </w:pPr>
+            <w:r>
+              <w:rPr>
+                <w:rFonts w:ascii="Calibri" w:cs="Calibri" w:eastAsia="Calibri" w:hAnsi="Calibri"/>
+                <w:sz w:val="16"/>
+                <w:szCs w:val="16"/>
+              </w:rPr>
+              <w:t xml:space="preserve">–</w:t>
+            </w:r>
+          </w:p>
+        </w:tc>
+      </w:tr>
+      <w:tr>
+        <w:tc>
+          <w:tcPr>
+            <w:tcW w:type="pct" w:w="22%"/>
+            <w:shd w:fill="FFFFFF" w:color="auto" w:val="clear"/>
+            <w:tcMar>
+              <w:top w:type="dxa" w:w="60"/>
+              <w:left w:type="dxa" w:w="80"/>
+              <w:bottom w:type="dxa" w:w="60"/>
+              <w:right w:type="dxa" w:w="80"/>
+            </w:tcMar>
+          </w:tcPr>
+          <w:p>
+            <w:pPr>
+              <w:jc w:val="left"/>
+            </w:pPr>
+            <w:r>
+              <w:rPr>
+                <w:rFonts w:ascii="Calibri" w:cs="Calibri" w:eastAsia="Calibri" w:hAnsi="Calibri"/>
+                <w:sz w:val="16"/>
+                <w:szCs w:val="16"/>
+              </w:rPr>
+              <w:t xml:space="preserve">Audit Log</w:t>
+            </w:r>
+          </w:p>
+        </w:tc>
+        <w:tc>
+          <w:tcPr>
+            <w:tcW w:type="pct" w:w="8.666666666666666%"/>
+            <w:shd w:fill="FFFFFF" w:color="auto" w:val="clear"/>
+            <w:tcMar>
+              <w:top w:type="dxa" w:w="60"/>
+              <w:left w:type="dxa" w:w="80"/>
+              <w:bottom w:type="dxa" w:w="60"/>
+              <w:right w:type="dxa" w:w="80"/>
+            </w:tcMar>
+          </w:tcPr>
+          <w:p>
+            <w:pPr>
+              <w:jc w:val="center"/>
+            </w:pPr>
+            <w:r>
+              <w:rPr>
+                <w:rFonts w:ascii="Calibri" w:cs="Calibri" w:eastAsia="Calibri" w:hAnsi="Calibri"/>
+                <w:sz w:val="16"/>
+                <w:szCs w:val="16"/>
+              </w:rPr>
+              <w:t xml:space="preserve">–</w:t>
+            </w:r>
+          </w:p>
+        </w:tc>
+        <w:tc>
+          <w:tcPr>
+            <w:tcW w:type="pct" w:w="8.666666666666666%"/>
+            <w:shd w:fill="FFFFFF" w:color="auto" w:val="clear"/>
+            <w:tcMar>
+              <w:top w:type="dxa" w:w="60"/>
+              <w:left w:type="dxa" w:w="80"/>
+              <w:bottom w:type="dxa" w:w="60"/>
+              <w:right w:type="dxa" w:w="80"/>
+            </w:tcMar>
+          </w:tcPr>
+          <w:p>
+            <w:pPr>
+              <w:jc w:val="center"/>
+            </w:pPr>
+            <w:r>
+              <w:rPr>
+                <w:rFonts w:ascii="Calibri" w:cs="Calibri" w:eastAsia="Calibri" w:hAnsi="Calibri"/>
+                <w:sz w:val="16"/>
+                <w:szCs w:val="16"/>
+              </w:rPr>
+              <w:t xml:space="preserve">–</w:t>
+            </w:r>
+          </w:p>
+        </w:tc>
+        <w:tc>
+          <w:tcPr>
+            <w:tcW w:type="pct" w:w="8.666666666666666%"/>
+            <w:shd w:fill="FFFFFF" w:color="auto" w:val="clear"/>
+            <w:tcMar>
+              <w:top w:type="dxa" w:w="60"/>
+              <w:left w:type="dxa" w:w="80"/>
+              <w:bottom w:type="dxa" w:w="60"/>
+              <w:right w:type="dxa" w:w="80"/>
+            </w:tcMar>
+          </w:tcPr>
+          <w:p>
+            <w:pPr>
+              <w:jc w:val="center"/>
+            </w:pPr>
+            <w:r>
+              <w:rPr>
+                <w:rFonts w:ascii="Calibri" w:cs="Calibri" w:eastAsia="Calibri" w:hAnsi="Calibri"/>
+                <w:sz w:val="16"/>
+                <w:szCs w:val="16"/>
+              </w:rPr>
+              <w:t xml:space="preserve">–</w:t>
+            </w:r>
+          </w:p>
+        </w:tc>
+        <w:tc>
+          <w:tcPr>
+            <w:tcW w:type="pct" w:w="8.666666666666666%"/>
+            <w:shd w:fill="FFFFFF" w:color="auto" w:val="clear"/>
+            <w:tcMar>
+              <w:top w:type="dxa" w:w="60"/>
+              <w:left w:type="dxa" w:w="80"/>
+              <w:bottom w:type="dxa" w:w="60"/>
+              <w:right w:type="dxa" w:w="80"/>
+            </w:tcMar>
+          </w:tcPr>
+          <w:p>
+            <w:pPr>
+              <w:jc w:val="center"/>
+            </w:pPr>
+            <w:r>
+              <w:rPr>
+                <w:rFonts w:ascii="Calibri" w:cs="Calibri" w:eastAsia="Calibri" w:hAnsi="Calibri"/>
+                <w:sz w:val="16"/>
+                <w:szCs w:val="16"/>
+              </w:rPr>
+              <w:t xml:space="preserve">–</w:t>
+            </w:r>
+          </w:p>
+        </w:tc>
+        <w:tc>
+          <w:tcPr>
+            <w:tcW w:type="pct" w:w="8.666666666666666%"/>
+            <w:shd w:fill="FFFFFF" w:color="auto" w:val="clear"/>
+            <w:tcMar>
+              <w:top w:type="dxa" w:w="60"/>
+              <w:left w:type="dxa" w:w="80"/>
+              <w:bottom w:type="dxa" w:w="60"/>
+              <w:right w:type="dxa" w:w="80"/>
+            </w:tcMar>
+          </w:tcPr>
+          <w:p>
+            <w:pPr>
+              <w:jc w:val="center"/>
+            </w:pPr>
+            <w:r>
+              <w:rPr>
+                <w:rFonts w:ascii="Calibri" w:cs="Calibri" w:eastAsia="Calibri" w:hAnsi="Calibri"/>
+                <w:sz w:val="16"/>
+                <w:szCs w:val="16"/>
+              </w:rPr>
+              <w:t xml:space="preserve">–</w:t>
+            </w:r>
+          </w:p>
+        </w:tc>
+        <w:tc>
+          <w:tcPr>
+            <w:tcW w:type="pct" w:w="8.666666666666666%"/>
+            <w:shd w:fill="FFFFFF" w:color="auto" w:val="clear"/>
+            <w:tcMar>
+              <w:top w:type="dxa" w:w="60"/>
+              <w:left w:type="dxa" w:w="80"/>
+              <w:bottom w:type="dxa" w:w="60"/>
+              <w:right w:type="dxa" w:w="80"/>
+            </w:tcMar>
+          </w:tcPr>
+          <w:p>
+            <w:pPr>
+              <w:jc w:val="center"/>
+            </w:pPr>
+            <w:r>
+              <w:rPr>
+                <w:rFonts w:ascii="Calibri" w:cs="Calibri" w:eastAsia="Calibri" w:hAnsi="Calibri"/>
+                <w:sz w:val="16"/>
+                <w:szCs w:val="16"/>
+              </w:rPr>
+              <w:t xml:space="preserve">–</w:t>
+            </w:r>
+          </w:p>
+        </w:tc>
+        <w:tc>
+          <w:tcPr>
+            <w:tcW w:type="pct" w:w="8.666666666666666%"/>
+            <w:shd w:fill="FFFFFF" w:color="auto" w:val="clear"/>
+            <w:tcMar>
+              <w:top w:type="dxa" w:w="60"/>
+              <w:left w:type="dxa" w:w="80"/>
+              <w:bottom w:type="dxa" w:w="60"/>
+              <w:right w:type="dxa" w:w="80"/>
+            </w:tcMar>
+          </w:tcPr>
+          <w:p>
+            <w:pPr>
+              <w:jc w:val="center"/>
+            </w:pPr>
+            <w:r>
+              <w:rPr>
+                <w:rFonts w:ascii="Calibri" w:cs="Calibri" w:eastAsia="Calibri" w:hAnsi="Calibri"/>
+                <w:sz w:val="16"/>
+                <w:szCs w:val="16"/>
+              </w:rPr>
+              <w:t xml:space="preserve">–</w:t>
+            </w:r>
+          </w:p>
+        </w:tc>
+        <w:tc>
+          <w:tcPr>
+            <w:tcW w:type="pct" w:w="8.666666666666666%"/>
+            <w:shd w:fill="FFFFFF" w:color="auto" w:val="clear"/>
+            <w:tcMar>
+              <w:top w:type="dxa" w:w="60"/>
+              <w:left w:type="dxa" w:w="80"/>
+              <w:bottom w:type="dxa" w:w="60"/>
+              <w:right w:type="dxa" w:w="80"/>
+            </w:tcMar>
+          </w:tcPr>
+          <w:p>
+            <w:pPr>
+              <w:jc w:val="center"/>
+            </w:pPr>
+            <w:r>
+              <w:rPr>
+                <w:rFonts w:ascii="Calibri" w:cs="Calibri" w:eastAsia="Calibri" w:hAnsi="Calibri"/>
+                <w:sz w:val="16"/>
+                <w:szCs w:val="16"/>
+              </w:rPr>
+              <w:t xml:space="preserve">–</w:t>
+            </w:r>
+          </w:p>
+        </w:tc>
+        <w:tc>
+          <w:tcPr>
+            <w:tcW w:type="pct" w:w="8.666666666666666%"/>
+            <w:shd w:fill="FFFFFF" w:color="auto" w:val="clear"/>
+            <w:tcMar>
+              <w:top w:type="dxa" w:w="60"/>
+              <w:left w:type="dxa" w:w="80"/>
+              <w:bottom w:type="dxa" w:w="60"/>
+              <w:right w:type="dxa" w:w="80"/>
+            </w:tcMar>
+          </w:tcPr>
+          <w:p>
+            <w:pPr>
+              <w:jc w:val="center"/>
+            </w:pPr>
+            <w:r>
+              <w:rPr>
+                <w:rFonts w:ascii="Calibri" w:cs="Calibri" w:eastAsia="Calibri" w:hAnsi="Calibri"/>
+                <w:sz w:val="16"/>
+                <w:szCs w:val="16"/>
+              </w:rPr>
+              <w:t xml:space="preserve">✓</w:t>
+            </w:r>
+          </w:p>
+        </w:tc>
+      </w:tr>
+      <w:tr>
+        <w:tc>
+          <w:tcPr>
+            <w:tcW w:type="pct" w:w="22%"/>
+            <w:shd w:fill="F1F5F9" w:color="auto" w:val="clear"/>
+            <w:tcMar>
+              <w:top w:type="dxa" w:w="60"/>
+              <w:left w:type="dxa" w:w="80"/>
+              <w:bottom w:type="dxa" w:w="60"/>
+              <w:right w:type="dxa" w:w="80"/>
+            </w:tcMar>
+          </w:tcPr>
+          <w:p>
+            <w:pPr>
+              <w:jc w:val="left"/>
+            </w:pPr>
+            <w:r>
+              <w:rPr>
+                <w:rFonts w:ascii="Calibri" w:cs="Calibri" w:eastAsia="Calibri" w:hAnsi="Calibri"/>
+                <w:sz w:val="16"/>
+                <w:szCs w:val="16"/>
+              </w:rPr>
+              <w:t xml:space="preserve">Settings</w:t>
+            </w:r>
+          </w:p>
+        </w:tc>
+        <w:tc>
+          <w:tcPr>
+            <w:tcW w:type="pct" w:w="8.666666666666666%"/>
+            <w:shd w:fill="F1F5F9" w:color="auto" w:val="clear"/>
+            <w:tcMar>
+              <w:top w:type="dxa" w:w="60"/>
+              <w:left w:type="dxa" w:w="80"/>
+              <w:bottom w:type="dxa" w:w="60"/>
+              <w:right w:type="dxa" w:w="80"/>
+            </w:tcMar>
+          </w:tcPr>
+          <w:p>
+            <w:pPr>
+              <w:jc w:val="center"/>
+            </w:pPr>
+            <w:r>
+              <w:rPr>
+                <w:rFonts w:ascii="Calibri" w:cs="Calibri" w:eastAsia="Calibri" w:hAnsi="Calibri"/>
+                <w:sz w:val="16"/>
+                <w:szCs w:val="16"/>
+              </w:rPr>
+              <w:t xml:space="preserve">✓</w:t>
+            </w:r>
+          </w:p>
+        </w:tc>
+        <w:tc>
+          <w:tcPr>
+            <w:tcW w:type="pct" w:w="8.666666666666666%"/>
+            <w:shd w:fill="F1F5F9" w:color="auto" w:val="clear"/>
+            <w:tcMar>
+              <w:top w:type="dxa" w:w="60"/>
+              <w:left w:type="dxa" w:w="80"/>
+              <w:bottom w:type="dxa" w:w="60"/>
+              <w:right w:type="dxa" w:w="80"/>
+            </w:tcMar>
+          </w:tcPr>
+          <w:p>
+            <w:pPr>
+              <w:jc w:val="center"/>
+            </w:pPr>
+            <w:r>
+              <w:rPr>
+                <w:rFonts w:ascii="Calibri" w:cs="Calibri" w:eastAsia="Calibri" w:hAnsi="Calibri"/>
+                <w:sz w:val="16"/>
+                <w:szCs w:val="16"/>
+              </w:rPr>
+              <w:t xml:space="preserve">✓</w:t>
+            </w:r>
+          </w:p>
+        </w:tc>
+        <w:tc>
+          <w:tcPr>
+            <w:tcW w:type="pct" w:w="8.666666666666666%"/>
+            <w:shd w:fill="F1F5F9" w:color="auto" w:val="clear"/>
+            <w:tcMar>
+              <w:top w:type="dxa" w:w="60"/>
+              <w:left w:type="dxa" w:w="80"/>
+              <w:bottom w:type="dxa" w:w="60"/>
+              <w:right w:type="dxa" w:w="80"/>
+            </w:tcMar>
+          </w:tcPr>
+          <w:p>
+            <w:pPr>
+              <w:jc w:val="center"/>
+            </w:pPr>
+            <w:r>
+              <w:rPr>
+                <w:rFonts w:ascii="Calibri" w:cs="Calibri" w:eastAsia="Calibri" w:hAnsi="Calibri"/>
+                <w:sz w:val="16"/>
+                <w:szCs w:val="16"/>
+              </w:rPr>
+              <w:t xml:space="preserve">✓</w:t>
+            </w:r>
+          </w:p>
+        </w:tc>
+        <w:tc>
+          <w:tcPr>
+            <w:tcW w:type="pct" w:w="8.666666666666666%"/>
+            <w:shd w:fill="F1F5F9" w:color="auto" w:val="clear"/>
+            <w:tcMar>
+              <w:top w:type="dxa" w:w="60"/>
+              <w:left w:type="dxa" w:w="80"/>
+              <w:bottom w:type="dxa" w:w="60"/>
+              <w:right w:type="dxa" w:w="80"/>
+            </w:tcMar>
+          </w:tcPr>
+          <w:p>
+            <w:pPr>
+              <w:jc w:val="center"/>
+            </w:pPr>
+            <w:r>
+              <w:rPr>
+                <w:rFonts w:ascii="Calibri" w:cs="Calibri" w:eastAsia="Calibri" w:hAnsi="Calibri"/>
+                <w:sz w:val="16"/>
+                <w:szCs w:val="16"/>
+              </w:rPr>
+              <w:t xml:space="preserve">✓</w:t>
+            </w:r>
+          </w:p>
+        </w:tc>
+        <w:tc>
+          <w:tcPr>
+            <w:tcW w:type="pct" w:w="8.666666666666666%"/>
+            <w:shd w:fill="F1F5F9" w:color="auto" w:val="clear"/>
+            <w:tcMar>
+              <w:top w:type="dxa" w:w="60"/>
+              <w:left w:type="dxa" w:w="80"/>
+              <w:bottom w:type="dxa" w:w="60"/>
+              <w:right w:type="dxa" w:w="80"/>
+            </w:tcMar>
+          </w:tcPr>
+          <w:p>
+            <w:pPr>
+              <w:jc w:val="center"/>
+            </w:pPr>
+            <w:r>
+              <w:rPr>
+                <w:rFonts w:ascii="Calibri" w:cs="Calibri" w:eastAsia="Calibri" w:hAnsi="Calibri"/>
+                <w:sz w:val="16"/>
+                <w:szCs w:val="16"/>
+              </w:rPr>
+              <w:t xml:space="preserve">✓</w:t>
+            </w:r>
+          </w:p>
+        </w:tc>
+        <w:tc>
+          <w:tcPr>
+            <w:tcW w:type="pct" w:w="8.666666666666666%"/>
+            <w:shd w:fill="F1F5F9" w:color="auto" w:val="clear"/>
+            <w:tcMar>
+              <w:top w:type="dxa" w:w="60"/>
+              <w:left w:type="dxa" w:w="80"/>
+              <w:bottom w:type="dxa" w:w="60"/>
+              <w:right w:type="dxa" w:w="80"/>
+            </w:tcMar>
+          </w:tcPr>
+          <w:p>
+            <w:pPr>
+              <w:jc w:val="center"/>
+            </w:pPr>
+            <w:r>
+              <w:rPr>
+                <w:rFonts w:ascii="Calibri" w:cs="Calibri" w:eastAsia="Calibri" w:hAnsi="Calibri"/>
+                <w:sz w:val="16"/>
+                <w:szCs w:val="16"/>
+              </w:rPr>
+              <w:t xml:space="preserve">✓</w:t>
+            </w:r>
+          </w:p>
+        </w:tc>
+        <w:tc>
+          <w:tcPr>
+            <w:tcW w:type="pct" w:w="8.666666666666666%"/>
+            <w:shd w:fill="F1F5F9" w:color="auto" w:val="clear"/>
+            <w:tcMar>
+              <w:top w:type="dxa" w:w="60"/>
+              <w:left w:type="dxa" w:w="80"/>
+              <w:bottom w:type="dxa" w:w="60"/>
+              <w:right w:type="dxa" w:w="80"/>
+            </w:tcMar>
+          </w:tcPr>
+          <w:p>
+            <w:pPr>
+              <w:jc w:val="center"/>
+            </w:pPr>
+            <w:r>
+              <w:rPr>
+                <w:rFonts w:ascii="Calibri" w:cs="Calibri" w:eastAsia="Calibri" w:hAnsi="Calibri"/>
+                <w:sz w:val="16"/>
+                <w:szCs w:val="16"/>
+              </w:rPr>
+              <w:t xml:space="preserve">✓</w:t>
+            </w:r>
+          </w:p>
+        </w:tc>
+        <w:tc>
+          <w:tcPr>
+            <w:tcW w:type="pct" w:w="8.666666666666666%"/>
+            <w:shd w:fill="F1F5F9" w:color="auto" w:val="clear"/>
+            <w:tcMar>
+              <w:top w:type="dxa" w:w="60"/>
+              <w:left w:type="dxa" w:w="80"/>
+              <w:bottom w:type="dxa" w:w="60"/>
+              <w:right w:type="dxa" w:w="80"/>
+            </w:tcMar>
+          </w:tcPr>
+          <w:p>
+            <w:pPr>
+              <w:jc w:val="center"/>
+            </w:pPr>
+            <w:r>
+              <w:rPr>
+                <w:rFonts w:ascii="Calibri" w:cs="Calibri" w:eastAsia="Calibri" w:hAnsi="Calibri"/>
+                <w:sz w:val="16"/>
+                <w:szCs w:val="16"/>
+              </w:rPr>
+              <w:t xml:space="preserve">✓</w:t>
+            </w:r>
+          </w:p>
+        </w:tc>
+        <w:tc>
+          <w:tcPr>
+            <w:tcW w:type="pct" w:w="8.666666666666666%"/>
+            <w:shd w:fill="F1F5F9" w:color="auto" w:val="clear"/>
+            <w:tcMar>
+              <w:top w:type="dxa" w:w="60"/>
+              <w:left w:type="dxa" w:w="80"/>
+              <w:bottom w:type="dxa" w:w="60"/>
+              <w:right w:type="dxa" w:w="80"/>
+            </w:tcMar>
+          </w:tcPr>
+          <w:p>
+            <w:pPr>
+              <w:jc w:val="center"/>
+            </w:pPr>
+            <w:r>
+              <w:rPr>
+                <w:rFonts w:ascii="Calibri" w:cs="Calibri" w:eastAsia="Calibri" w:hAnsi="Calibri"/>
+                <w:sz w:val="16"/>
+                <w:szCs w:val="16"/>
+              </w:rPr>
+              <w:t xml:space="preserve">✓</w:t>
+            </w:r>
+          </w:p>
+        </w:tc>
+      </w:tr>
+      <w:tr>
+        <w:tc>
+          <w:tcPr>
+            <w:tcW w:type="pct" w:w="22%"/>
+            <w:shd w:fill="FFFFFF" w:color="auto" w:val="clear"/>
+            <w:tcMar>
+              <w:top w:type="dxa" w:w="60"/>
+              <w:left w:type="dxa" w:w="80"/>
+              <w:bottom w:type="dxa" w:w="60"/>
+              <w:right w:type="dxa" w:w="80"/>
+            </w:tcMar>
+          </w:tcPr>
+          <w:p>
+            <w:pPr>
+              <w:jc w:val="left"/>
+            </w:pPr>
+            <w:r>
+              <w:rPr>
+                <w:rFonts w:ascii="Calibri" w:cs="Calibri" w:eastAsia="Calibri" w:hAnsi="Calibri"/>
+                <w:sz w:val="16"/>
+                <w:szCs w:val="16"/>
+              </w:rPr>
               <w:t xml:space="preserve">Logout</w:t>
             </w:r>
           </w:p>
@@ -14910,7 +15888,7 @@
         <w:tc>
           <w:tcPr>
             <w:tcW w:type="pct" w:w="8.666666666666666%"/>
-            <w:shd w:fill="F1F5F9" w:color="auto" w:val="clear"/>
+            <w:shd w:fill="FFFFFF" w:color="auto" w:val="clear"/>
             <w:tcMar>
               <w:top w:type="dxa" w:w="60"/>
               <w:left w:type="dxa" w:w="80"/>
@@ -14935,7 +15913,7 @@
         <w:tc>
           <w:tcPr>
             <w:tcW w:type="pct" w:w="8.666666666666666%"/>
-            <w:shd w:fill="F1F5F9" w:color="auto" w:val="clear"/>
+            <w:shd w:fill="FFFFFF" w:color="auto" w:val="clear"/>
             <w:tcMar>
               <w:top w:type="dxa" w:w="60"/>
               <w:left w:type="dxa" w:w="80"/>
@@ -14960,7 +15938,7 @@
         <w:tc>
           <w:tcPr>
             <w:tcW w:type="pct" w:w="8.666666666666666%"/>
-            <w:shd w:fill="F1F5F9" w:color="auto" w:val="clear"/>
+            <w:shd w:fill="FFFFFF" w:color="auto" w:val="clear"/>
             <w:tcMar>
               <w:top w:type="dxa" w:w="60"/>
               <w:left w:type="dxa" w:w="80"/>
@@ -14985,7 +15963,7 @@
         <w:tc>
           <w:tcPr>
             <w:tcW w:type="pct" w:w="8.666666666666666%"/>
-            <w:shd w:fill="F1F5F9" w:color="auto" w:val="clear"/>
+            <w:shd w:fill="FFFFFF" w:color="auto" w:val="clear"/>
             <w:tcMar>
               <w:top w:type="dxa" w:w="60"/>
               <w:left w:type="dxa" w:w="80"/>
@@ -15010,7 +15988,7 @@
         <w:tc>
           <w:tcPr>
             <w:tcW w:type="pct" w:w="8.666666666666666%"/>
-            <w:shd w:fill="F1F5F9" w:color="auto" w:val="clear"/>
+            <w:shd w:fill="FFFFFF" w:color="auto" w:val="clear"/>
             <w:tcMar>
               <w:top w:type="dxa" w:w="60"/>
               <w:left w:type="dxa" w:w="80"/>
@@ -15035,7 +16013,7 @@
         <w:tc>
           <w:tcPr>
             <w:tcW w:type="pct" w:w="8.666666666666666%"/>
-            <w:shd w:fill="F1F5F9" w:color="auto" w:val="clear"/>
+            <w:shd w:fill="FFFFFF" w:color="auto" w:val="clear"/>
             <w:tcMar>
               <w:top w:type="dxa" w:w="60"/>
               <w:left w:type="dxa" w:w="80"/>
@@ -15060,7 +16038,7 @@
         <w:tc>
           <w:tcPr>
             <w:tcW w:type="pct" w:w="8.666666666666666%"/>
-            <w:shd w:fill="F1F5F9" w:color="auto" w:val="clear"/>
+            <w:shd w:fill="FFFFFF" w:color="auto" w:val="clear"/>
             <w:tcMar>
               <w:top w:type="dxa" w:w="60"/>
               <w:left w:type="dxa" w:w="80"/>
@@ -15085,7 +16063,7 @@
         <w:tc>
           <w:tcPr>
             <w:tcW w:type="pct" w:w="8.666666666666666%"/>
-            <w:shd w:fill="F1F5F9" w:color="auto" w:val="clear"/>
+            <w:shd w:fill="FFFFFF" w:color="auto" w:val="clear"/>
             <w:tcMar>
               <w:top w:type="dxa" w:w="60"/>
               <w:left w:type="dxa" w:w="80"/>
@@ -15110,7 +16088,7 @@
         <w:tc>
           <w:tcPr>
             <w:tcW w:type="pct" w:w="8.666666666666666%"/>
-            <w:shd w:fill="F1F5F9" w:color="auto" w:val="clear"/>
+            <w:shd w:fill="FFFFFF" w:color="auto" w:val="clear"/>
             <w:tcMar>
               <w:top w:type="dxa" w:w="60"/>
               <w:left w:type="dxa" w:w="80"/>

</xml_diff>